<commit_message>
Added user feedback + experimenting with multi-labeling model
</commit_message>
<xml_diff>
--- a/docs/Application Development Report.docx
+++ b/docs/Application Development Report.docx
@@ -811,6 +811,14 @@
     </w:sdt>
     <w:sdt>
       <w:sdtPr>
+        <w:rPr>
+          <w:rFonts w:asciiTheme="minorHAnsi" w:eastAsiaTheme="minorHAnsi" w:hAnsiTheme="minorHAnsi" w:cstheme="minorBidi"/>
+          <w:color w:val="auto"/>
+          <w:kern w:val="2"/>
+          <w:sz w:val="24"/>
+          <w:szCs w:val="24"/>
+          <w14:ligatures w14:val="standardContextual"/>
+        </w:rPr>
         <w:id w:val="-1854862105"/>
         <w:docPartObj>
           <w:docPartGallery w:val="Table of Contents"/>
@@ -819,15 +827,9 @@
       </w:sdtPr>
       <w:sdtEndPr>
         <w:rPr>
-          <w:rFonts w:asciiTheme="minorHAnsi" w:eastAsiaTheme="minorHAnsi" w:hAnsiTheme="minorHAnsi" w:cstheme="minorBidi"/>
           <w:b/>
           <w:bCs/>
           <w:noProof/>
-          <w:color w:val="auto"/>
-          <w:kern w:val="2"/>
-          <w:sz w:val="24"/>
-          <w:szCs w:val="24"/>
-          <w14:ligatures w14:val="standardContextual"/>
         </w:rPr>
       </w:sdtEndPr>
       <w:sdtContent>
@@ -2057,21 +2059,7 @@
         <w:rPr>
           <w:rFonts w:ascii="Times New Roman" w:hAnsi="Times New Roman" w:cs="Times New Roman"/>
         </w:rPr>
-        <w:t xml:space="preserve">In addition to technical validation, a CLIP-based validation step was implemented. The </w:t>
-      </w:r>
-      <w:proofErr w:type="gramStart"/>
-      <w:r>
-        <w:rPr>
-          <w:rFonts w:ascii="Times New Roman" w:hAnsi="Times New Roman" w:cs="Times New Roman"/>
-        </w:rPr>
-        <w:t>clothing type</w:t>
-      </w:r>
-      <w:proofErr w:type="gramEnd"/>
-      <w:r>
-        <w:rPr>
-          <w:rFonts w:ascii="Times New Roman" w:hAnsi="Times New Roman" w:cs="Times New Roman"/>
-        </w:rPr>
-        <w:t xml:space="preserve"> classifier can only predict one of the supported garment categories and cannot determine whether an uploaded image is </w:t>
+        <w:t xml:space="preserve">In addition to technical validation, a CLIP-based validation step was implemented. The clothing type classifier can only predict one of the supported garment categories and cannot determine whether an uploaded image is </w:t>
       </w:r>
       <w:r>
         <w:rPr>
@@ -2096,6 +2084,148 @@
     </w:p>
     <w:p>
       <w:pPr>
+        <w:rPr>
+          <w:rFonts w:ascii="Times New Roman" w:hAnsi="Times New Roman" w:cs="Times New Roman"/>
+        </w:rPr>
+      </w:pPr>
+      <w:r>
+        <w:rPr>
+          <w:rFonts w:ascii="Times New Roman" w:hAnsi="Times New Roman" w:cs="Times New Roman"/>
+        </w:rPr>
+        <w:drawing>
+          <wp:inline distT="0" distB="0" distL="0" distR="0" wp14:anchorId="59B196EB" wp14:editId="2A18FC42">
+            <wp:extent cx="6858000" cy="3895090"/>
+            <wp:effectExtent l="0" t="0" r="0" b="0"/>
+            <wp:docPr id="562593784" name="Picture 1"/>
+            <wp:cNvGraphicFramePr>
+              <a:graphicFrameLocks xmlns:a="http://schemas.openxmlformats.org/drawingml/2006/main" noChangeAspect="1"/>
+            </wp:cNvGraphicFramePr>
+            <a:graphic xmlns:a="http://schemas.openxmlformats.org/drawingml/2006/main">
+              <a:graphicData uri="http://schemas.openxmlformats.org/drawingml/2006/picture">
+                <pic:pic xmlns:pic="http://schemas.openxmlformats.org/drawingml/2006/picture">
+                  <pic:nvPicPr>
+                    <pic:cNvPr id="562593784" name=""/>
+                    <pic:cNvPicPr/>
+                  </pic:nvPicPr>
+                  <pic:blipFill>
+                    <a:blip r:embed="rId11"/>
+                    <a:stretch>
+                      <a:fillRect/>
+                    </a:stretch>
+                  </pic:blipFill>
+                  <pic:spPr>
+                    <a:xfrm>
+                      <a:off x="0" y="0"/>
+                      <a:ext cx="6858000" cy="3895090"/>
+                    </a:xfrm>
+                    <a:prstGeom prst="rect">
+                      <a:avLst/>
+                    </a:prstGeom>
+                  </pic:spPr>
+                </pic:pic>
+              </a:graphicData>
+            </a:graphic>
+          </wp:inline>
+        </w:drawing>
+      </w:r>
+    </w:p>
+    <w:p>
+      <w:pPr>
+        <w:rPr>
+          <w:rFonts w:ascii="Times New Roman" w:hAnsi="Times New Roman" w:cs="Times New Roman"/>
+        </w:rPr>
+      </w:pPr>
+      <w:r>
+        <w:rPr>
+          <w:rFonts w:ascii="Times New Roman" w:hAnsi="Times New Roman" w:cs="Times New Roman"/>
+        </w:rPr>
+        <w:lastRenderedPageBreak/>
+        <w:drawing>
+          <wp:inline distT="0" distB="0" distL="0" distR="0" wp14:anchorId="19ED3BFB" wp14:editId="0ABDFC03">
+            <wp:extent cx="6858000" cy="4034790"/>
+            <wp:effectExtent l="0" t="0" r="0" b="3810"/>
+            <wp:docPr id="1305580283" name="Picture 1"/>
+            <wp:cNvGraphicFramePr>
+              <a:graphicFrameLocks xmlns:a="http://schemas.openxmlformats.org/drawingml/2006/main" noChangeAspect="1"/>
+            </wp:cNvGraphicFramePr>
+            <a:graphic xmlns:a="http://schemas.openxmlformats.org/drawingml/2006/main">
+              <a:graphicData uri="http://schemas.openxmlformats.org/drawingml/2006/picture">
+                <pic:pic xmlns:pic="http://schemas.openxmlformats.org/drawingml/2006/picture">
+                  <pic:nvPicPr>
+                    <pic:cNvPr id="1305580283" name=""/>
+                    <pic:cNvPicPr/>
+                  </pic:nvPicPr>
+                  <pic:blipFill>
+                    <a:blip r:embed="rId12"/>
+                    <a:stretch>
+                      <a:fillRect/>
+                    </a:stretch>
+                  </pic:blipFill>
+                  <pic:spPr>
+                    <a:xfrm>
+                      <a:off x="0" y="0"/>
+                      <a:ext cx="6858000" cy="4034790"/>
+                    </a:xfrm>
+                    <a:prstGeom prst="rect">
+                      <a:avLst/>
+                    </a:prstGeom>
+                  </pic:spPr>
+                </pic:pic>
+              </a:graphicData>
+            </a:graphic>
+          </wp:inline>
+        </w:drawing>
+      </w:r>
+    </w:p>
+    <w:p>
+      <w:pPr>
+        <w:rPr>
+          <w:rFonts w:ascii="Times New Roman" w:hAnsi="Times New Roman" w:cs="Times New Roman"/>
+        </w:rPr>
+      </w:pPr>
+      <w:r>
+        <w:rPr>
+          <w:rFonts w:ascii="Times New Roman" w:hAnsi="Times New Roman" w:cs="Times New Roman"/>
+        </w:rPr>
+        <w:drawing>
+          <wp:inline distT="0" distB="0" distL="0" distR="0" wp14:anchorId="0CA605A7" wp14:editId="628B4608">
+            <wp:extent cx="6858000" cy="2715260"/>
+            <wp:effectExtent l="0" t="0" r="0" b="8890"/>
+            <wp:docPr id="1402753984" name="Picture 1"/>
+            <wp:cNvGraphicFramePr>
+              <a:graphicFrameLocks xmlns:a="http://schemas.openxmlformats.org/drawingml/2006/main" noChangeAspect="1"/>
+            </wp:cNvGraphicFramePr>
+            <a:graphic xmlns:a="http://schemas.openxmlformats.org/drawingml/2006/main">
+              <a:graphicData uri="http://schemas.openxmlformats.org/drawingml/2006/picture">
+                <pic:pic xmlns:pic="http://schemas.openxmlformats.org/drawingml/2006/picture">
+                  <pic:nvPicPr>
+                    <pic:cNvPr id="1402753984" name=""/>
+                    <pic:cNvPicPr/>
+                  </pic:nvPicPr>
+                  <pic:blipFill>
+                    <a:blip r:embed="rId13"/>
+                    <a:stretch>
+                      <a:fillRect/>
+                    </a:stretch>
+                  </pic:blipFill>
+                  <pic:spPr>
+                    <a:xfrm>
+                      <a:off x="0" y="0"/>
+                      <a:ext cx="6858000" cy="2715260"/>
+                    </a:xfrm>
+                    <a:prstGeom prst="rect">
+                      <a:avLst/>
+                    </a:prstGeom>
+                  </pic:spPr>
+                </pic:pic>
+              </a:graphicData>
+            </a:graphic>
+          </wp:inline>
+        </w:drawing>
+      </w:r>
+    </w:p>
+    <w:p>
+      <w:pPr>
         <w:pStyle w:val="Heading2"/>
         <w:jc w:val="center"/>
         <w:rPr>
@@ -2151,6 +2281,7 @@
         <w:rPr>
           <w:rFonts w:ascii="Times New Roman" w:hAnsi="Times New Roman" w:cs="Times New Roman"/>
         </w:rPr>
+        <w:lastRenderedPageBreak/>
         <w:t>Besides the predictions themselves, the application also calculates confidence scores. These scores indicate how certain the models are about their predictions. Instead of hiding this information, it is presented to the user as part of the analysis process.</w:t>
       </w:r>
     </w:p>
@@ -2246,6 +2377,53 @@
     </w:p>
     <w:p>
       <w:pPr>
+        <w:rPr>
+          <w:rFonts w:ascii="Times New Roman" w:hAnsi="Times New Roman" w:cs="Times New Roman"/>
+        </w:rPr>
+      </w:pPr>
+      <w:r>
+        <w:rPr>
+          <w:rFonts w:ascii="Times New Roman" w:hAnsi="Times New Roman" w:cs="Times New Roman"/>
+        </w:rPr>
+        <w:drawing>
+          <wp:inline distT="0" distB="0" distL="0" distR="0" wp14:anchorId="7F37C0E8" wp14:editId="469F5337">
+            <wp:extent cx="6858000" cy="3221355"/>
+            <wp:effectExtent l="0" t="0" r="0" b="0"/>
+            <wp:docPr id="264638785" name="Picture 1"/>
+            <wp:cNvGraphicFramePr>
+              <a:graphicFrameLocks xmlns:a="http://schemas.openxmlformats.org/drawingml/2006/main" noChangeAspect="1"/>
+            </wp:cNvGraphicFramePr>
+            <a:graphic xmlns:a="http://schemas.openxmlformats.org/drawingml/2006/main">
+              <a:graphicData uri="http://schemas.openxmlformats.org/drawingml/2006/picture">
+                <pic:pic xmlns:pic="http://schemas.openxmlformats.org/drawingml/2006/picture">
+                  <pic:nvPicPr>
+                    <pic:cNvPr id="264638785" name=""/>
+                    <pic:cNvPicPr/>
+                  </pic:nvPicPr>
+                  <pic:blipFill>
+                    <a:blip r:embed="rId14"/>
+                    <a:stretch>
+                      <a:fillRect/>
+                    </a:stretch>
+                  </pic:blipFill>
+                  <pic:spPr>
+                    <a:xfrm>
+                      <a:off x="0" y="0"/>
+                      <a:ext cx="6858000" cy="3221355"/>
+                    </a:xfrm>
+                    <a:prstGeom prst="rect">
+                      <a:avLst/>
+                    </a:prstGeom>
+                  </pic:spPr>
+                </pic:pic>
+              </a:graphicData>
+            </a:graphic>
+          </wp:inline>
+        </w:drawing>
+      </w:r>
+    </w:p>
+    <w:p>
+      <w:pPr>
         <w:pStyle w:val="Heading2"/>
         <w:jc w:val="center"/>
         <w:rPr>
@@ -2366,6 +2544,7 @@
         <w:rPr>
           <w:rFonts w:ascii="Times New Roman" w:hAnsi="Times New Roman" w:cs="Times New Roman"/>
         </w:rPr>
+        <w:lastRenderedPageBreak/>
         <w:t>Exclude items that belong to the same garment type as the uploaded item.</w:t>
       </w:r>
     </w:p>
@@ -2417,7 +2596,6 @@
         <w:rPr>
           <w:rFonts w:ascii="Times New Roman" w:hAnsi="Times New Roman" w:cs="Times New Roman"/>
         </w:rPr>
-        <w:lastRenderedPageBreak/>
         <w:t>Build outfit suggestions from the selected items.</w:t>
       </w:r>
     </w:p>
@@ -2453,19 +2631,58 @@
           <w:rFonts w:ascii="Times New Roman" w:hAnsi="Times New Roman" w:cs="Times New Roman"/>
         </w:rPr>
       </w:pPr>
-      <w:proofErr w:type="gramStart"/>
-      <w:r>
-        <w:rPr>
-          <w:rFonts w:ascii="Times New Roman" w:hAnsi="Times New Roman" w:cs="Times New Roman"/>
-        </w:rPr>
-        <w:t>The final result</w:t>
-      </w:r>
-      <w:proofErr w:type="gramEnd"/>
-      <w:r>
-        <w:rPr>
-          <w:rFonts w:ascii="Times New Roman" w:hAnsi="Times New Roman" w:cs="Times New Roman"/>
-        </w:rPr>
-        <w:t xml:space="preserve"> is a recommendation system that combines classification and visual similarity. The classification models determine what kind of item the user uploaded, while CLIP helps identify catalogue items that visually fit the same aesthetic direction.</w:t>
+      <w:r>
+        <w:rPr>
+          <w:rFonts w:ascii="Times New Roman" w:hAnsi="Times New Roman" w:cs="Times New Roman"/>
+        </w:rPr>
+        <w:t>The final result is a recommendation system that combines classification and visual similarity. The classification models determine what kind of item the user uploaded, while CLIP helps identify catalogue items that visually fit the same aesthetic direction.</w:t>
+      </w:r>
+    </w:p>
+    <w:p>
+      <w:pPr>
+        <w:rPr>
+          <w:rFonts w:ascii="Times New Roman" w:hAnsi="Times New Roman" w:cs="Times New Roman"/>
+        </w:rPr>
+      </w:pPr>
+      <w:r>
+        <w:rPr>
+          <w:rFonts w:ascii="Times New Roman" w:hAnsi="Times New Roman" w:cs="Times New Roman"/>
+        </w:rPr>
+        <w:drawing>
+          <wp:inline distT="0" distB="0" distL="0" distR="0" wp14:anchorId="2B4D748A" wp14:editId="3B2738FD">
+            <wp:extent cx="6858000" cy="3343910"/>
+            <wp:effectExtent l="0" t="0" r="0" b="8890"/>
+            <wp:docPr id="472739824" name="Picture 1"/>
+            <wp:cNvGraphicFramePr>
+              <a:graphicFrameLocks xmlns:a="http://schemas.openxmlformats.org/drawingml/2006/main" noChangeAspect="1"/>
+            </wp:cNvGraphicFramePr>
+            <a:graphic xmlns:a="http://schemas.openxmlformats.org/drawingml/2006/main">
+              <a:graphicData uri="http://schemas.openxmlformats.org/drawingml/2006/picture">
+                <pic:pic xmlns:pic="http://schemas.openxmlformats.org/drawingml/2006/picture">
+                  <pic:nvPicPr>
+                    <pic:cNvPr id="472739824" name=""/>
+                    <pic:cNvPicPr/>
+                  </pic:nvPicPr>
+                  <pic:blipFill>
+                    <a:blip r:embed="rId15"/>
+                    <a:stretch>
+                      <a:fillRect/>
+                    </a:stretch>
+                  </pic:blipFill>
+                  <pic:spPr>
+                    <a:xfrm>
+                      <a:off x="0" y="0"/>
+                      <a:ext cx="6858000" cy="3343910"/>
+                    </a:xfrm>
+                    <a:prstGeom prst="rect">
+                      <a:avLst/>
+                    </a:prstGeom>
+                  </pic:spPr>
+                </pic:pic>
+              </a:graphicData>
+            </a:graphic>
+          </wp:inline>
+        </w:drawing>
       </w:r>
     </w:p>
     <w:p>
@@ -2538,6 +2755,7 @@
         <w:rPr>
           <w:rFonts w:ascii="Times New Roman" w:hAnsi="Times New Roman" w:cs="Times New Roman"/>
         </w:rPr>
+        <w:lastRenderedPageBreak/>
         <w:t>When the model is confident, the application behaves normally and generates recommendations for a single aesthetic direction. When confidence is lower or another style has a similar probability, the backend generates multiple style candidates.</w:t>
       </w:r>
     </w:p>
@@ -2663,6 +2881,53 @@
     </w:p>
     <w:p>
       <w:pPr>
+        <w:rPr>
+          <w:rFonts w:ascii="Times New Roman" w:hAnsi="Times New Roman" w:cs="Times New Roman"/>
+        </w:rPr>
+      </w:pPr>
+      <w:r>
+        <w:rPr>
+          <w:rFonts w:ascii="Times New Roman" w:hAnsi="Times New Roman" w:cs="Times New Roman"/>
+        </w:rPr>
+        <w:drawing>
+          <wp:inline distT="0" distB="0" distL="0" distR="0" wp14:anchorId="4D5F98B5" wp14:editId="5D6B4F7A">
+            <wp:extent cx="6858000" cy="3329305"/>
+            <wp:effectExtent l="0" t="0" r="0" b="4445"/>
+            <wp:docPr id="538656718" name="Picture 1"/>
+            <wp:cNvGraphicFramePr>
+              <a:graphicFrameLocks xmlns:a="http://schemas.openxmlformats.org/drawingml/2006/main" noChangeAspect="1"/>
+            </wp:cNvGraphicFramePr>
+            <a:graphic xmlns:a="http://schemas.openxmlformats.org/drawingml/2006/main">
+              <a:graphicData uri="http://schemas.openxmlformats.org/drawingml/2006/picture">
+                <pic:pic xmlns:pic="http://schemas.openxmlformats.org/drawingml/2006/picture">
+                  <pic:nvPicPr>
+                    <pic:cNvPr id="538656718" name=""/>
+                    <pic:cNvPicPr/>
+                  </pic:nvPicPr>
+                  <pic:blipFill>
+                    <a:blip r:embed="rId16"/>
+                    <a:stretch>
+                      <a:fillRect/>
+                    </a:stretch>
+                  </pic:blipFill>
+                  <pic:spPr>
+                    <a:xfrm>
+                      <a:off x="0" y="0"/>
+                      <a:ext cx="6858000" cy="3329305"/>
+                    </a:xfrm>
+                    <a:prstGeom prst="rect">
+                      <a:avLst/>
+                    </a:prstGeom>
+                  </pic:spPr>
+                </pic:pic>
+              </a:graphicData>
+            </a:graphic>
+          </wp:inline>
+        </w:drawing>
+      </w:r>
+    </w:p>
+    <w:p>
+      <w:pPr>
         <w:pStyle w:val="Heading2"/>
         <w:jc w:val="center"/>
         <w:rPr>
@@ -2705,20 +2970,20 @@
         <w:rPr>
           <w:rFonts w:ascii="Times New Roman" w:hAnsi="Times New Roman" w:cs="Times New Roman"/>
         </w:rPr>
+        <w:t>During testing, it became clear that users may like the overall outfit direction but dislike a specific recommended item. Without additional functionality, the only option would be to upload a different image and generate an entirely new set of recommendations.</w:t>
+      </w:r>
+    </w:p>
+    <w:p>
+      <w:pPr>
+        <w:rPr>
+          <w:rFonts w:ascii="Times New Roman" w:hAnsi="Times New Roman" w:cs="Times New Roman"/>
+        </w:rPr>
+      </w:pPr>
+      <w:r>
+        <w:rPr>
+          <w:rFonts w:ascii="Times New Roman" w:hAnsi="Times New Roman" w:cs="Times New Roman"/>
+        </w:rPr>
         <w:lastRenderedPageBreak/>
-        <w:t>During testing, it became clear that users may like the overall outfit direction but dislike a specific recommended item. Without additional functionality, the only option would be to upload a different image and generate an entirely new set of recommendations.</w:t>
-      </w:r>
-    </w:p>
-    <w:p>
-      <w:pPr>
-        <w:rPr>
-          <w:rFonts w:ascii="Times New Roman" w:hAnsi="Times New Roman" w:cs="Times New Roman"/>
-        </w:rPr>
-      </w:pPr>
-      <w:r>
-        <w:rPr>
-          <w:rFonts w:ascii="Times New Roman" w:hAnsi="Times New Roman" w:cs="Times New Roman"/>
-        </w:rPr>
         <w:t>To solve this, the application allows individual items within an outfit to be refreshed. When a user requests a replacement, the frontend sends the selected clothing category together with information about the current recommendation set.</w:t>
       </w:r>
     </w:p>
@@ -2863,45 +3128,9 @@
           <w:b/>
           <w:bCs/>
         </w:rPr>
-        <w:t>User Interface and User Experience Improvements</w:t>
-      </w:r>
-      <w:r>
-        <w:rPr>
-          <w:rFonts w:ascii="Times New Roman" w:hAnsi="Times New Roman" w:cs="Times New Roman"/>
-          <w:b/>
-          <w:bCs/>
-        </w:rPr>
-        <w:t xml:space="preserve"> </w:t>
-      </w:r>
-      <w:proofErr w:type="gramStart"/>
-      <w:r>
-        <w:rPr>
-          <w:rFonts w:ascii="Times New Roman" w:hAnsi="Times New Roman" w:cs="Times New Roman"/>
-          <w:b/>
-          <w:bCs/>
-        </w:rPr>
-        <w:t>( UI</w:t>
-      </w:r>
-      <w:proofErr w:type="gramEnd"/>
-      <w:r>
-        <w:rPr>
-          <w:rFonts w:ascii="Times New Roman" w:hAnsi="Times New Roman" w:cs="Times New Roman"/>
-          <w:b/>
-          <w:bCs/>
-        </w:rPr>
-        <w:t>/</w:t>
-      </w:r>
-      <w:proofErr w:type="gramStart"/>
-      <w:r>
-        <w:rPr>
-          <w:rFonts w:ascii="Times New Roman" w:hAnsi="Times New Roman" w:cs="Times New Roman"/>
-          <w:b/>
-          <w:bCs/>
-        </w:rPr>
-        <w:t>UX )</w:t>
+        <w:t>User Interface and User Experience Improvements ( UI/UX )</w:t>
       </w:r>
       <w:bookmarkEnd w:id="8"/>
-      <w:proofErr w:type="gramEnd"/>
     </w:p>
     <w:p>
       <w:pPr>
@@ -2991,8 +3220,102 @@
         <w:rPr>
           <w:rFonts w:ascii="Times New Roman" w:hAnsi="Times New Roman" w:cs="Times New Roman"/>
         </w:rPr>
+        <w:t>The layout was continuously refined to reduce scrolling, improve readability, and create a clearer visual hierarchy. Large section headers, simplified descriptions, and a more structured presentation of confidence information were introduced to make the application easier to navigate.</w:t>
+      </w:r>
+    </w:p>
+    <w:p>
+      <w:pPr>
+        <w:rPr>
+          <w:rFonts w:ascii="Times New Roman" w:hAnsi="Times New Roman" w:cs="Times New Roman"/>
+        </w:rPr>
+      </w:pPr>
+      <w:r>
+        <w:rPr>
+          <w:rFonts w:ascii="Times New Roman" w:hAnsi="Times New Roman" w:cs="Times New Roman"/>
+        </w:rPr>
         <w:lastRenderedPageBreak/>
-        <w:t>The layout was continuously refined to reduce scrolling, improve readability, and create a clearer visual hierarchy. Large section headers, simplified descriptions, and a more structured presentation of confidence information were introduced to make the application easier to navigate.</w:t>
+        <w:drawing>
+          <wp:inline distT="0" distB="0" distL="0" distR="0" wp14:anchorId="6D60DFE4" wp14:editId="7443E495">
+            <wp:extent cx="6858000" cy="2842260"/>
+            <wp:effectExtent l="0" t="0" r="0" b="0"/>
+            <wp:docPr id="602738017" name="Picture 1"/>
+            <wp:cNvGraphicFramePr>
+              <a:graphicFrameLocks xmlns:a="http://schemas.openxmlformats.org/drawingml/2006/main" noChangeAspect="1"/>
+            </wp:cNvGraphicFramePr>
+            <a:graphic xmlns:a="http://schemas.openxmlformats.org/drawingml/2006/main">
+              <a:graphicData uri="http://schemas.openxmlformats.org/drawingml/2006/picture">
+                <pic:pic xmlns:pic="http://schemas.openxmlformats.org/drawingml/2006/picture">
+                  <pic:nvPicPr>
+                    <pic:cNvPr id="602738017" name=""/>
+                    <pic:cNvPicPr/>
+                  </pic:nvPicPr>
+                  <pic:blipFill>
+                    <a:blip r:embed="rId17"/>
+                    <a:stretch>
+                      <a:fillRect/>
+                    </a:stretch>
+                  </pic:blipFill>
+                  <pic:spPr>
+                    <a:xfrm>
+                      <a:off x="0" y="0"/>
+                      <a:ext cx="6858000" cy="2842260"/>
+                    </a:xfrm>
+                    <a:prstGeom prst="rect">
+                      <a:avLst/>
+                    </a:prstGeom>
+                  </pic:spPr>
+                </pic:pic>
+              </a:graphicData>
+            </a:graphic>
+          </wp:inline>
+        </w:drawing>
+      </w:r>
+    </w:p>
+    <w:p>
+      <w:pPr>
+        <w:rPr>
+          <w:rFonts w:ascii="Times New Roman" w:hAnsi="Times New Roman" w:cs="Times New Roman"/>
+        </w:rPr>
+      </w:pPr>
+      <w:r>
+        <w:rPr>
+          <w:rFonts w:ascii="Times New Roman" w:hAnsi="Times New Roman" w:cs="Times New Roman"/>
+        </w:rPr>
+        <w:drawing>
+          <wp:inline distT="0" distB="0" distL="0" distR="0" wp14:anchorId="34AA5021" wp14:editId="1D6C12FE">
+            <wp:extent cx="6858000" cy="2080895"/>
+            <wp:effectExtent l="0" t="0" r="0" b="0"/>
+            <wp:docPr id="360079683" name="Picture 1"/>
+            <wp:cNvGraphicFramePr>
+              <a:graphicFrameLocks xmlns:a="http://schemas.openxmlformats.org/drawingml/2006/main" noChangeAspect="1"/>
+            </wp:cNvGraphicFramePr>
+            <a:graphic xmlns:a="http://schemas.openxmlformats.org/drawingml/2006/main">
+              <a:graphicData uri="http://schemas.openxmlformats.org/drawingml/2006/picture">
+                <pic:pic xmlns:pic="http://schemas.openxmlformats.org/drawingml/2006/picture">
+                  <pic:nvPicPr>
+                    <pic:cNvPr id="360079683" name=""/>
+                    <pic:cNvPicPr/>
+                  </pic:nvPicPr>
+                  <pic:blipFill>
+                    <a:blip r:embed="rId18"/>
+                    <a:stretch>
+                      <a:fillRect/>
+                    </a:stretch>
+                  </pic:blipFill>
+                  <pic:spPr>
+                    <a:xfrm>
+                      <a:off x="0" y="0"/>
+                      <a:ext cx="6858000" cy="2080895"/>
+                    </a:xfrm>
+                    <a:prstGeom prst="rect">
+                      <a:avLst/>
+                    </a:prstGeom>
+                  </pic:spPr>
+                </pic:pic>
+              </a:graphicData>
+            </a:graphic>
+          </wp:inline>
+        </w:drawing>
       </w:r>
     </w:p>
     <w:p>
@@ -3144,6 +3467,7 @@
         <w:rPr>
           <w:rFonts w:ascii="Times New Roman" w:hAnsi="Times New Roman" w:cs="Times New Roman"/>
         </w:rPr>
+        <w:lastRenderedPageBreak/>
         <w:t>CLIP embeddings for recommendation ranking</w:t>
       </w:r>
     </w:p>
@@ -3157,21 +3481,7 @@
         <w:rPr>
           <w:rFonts w:ascii="Times New Roman" w:hAnsi="Times New Roman" w:cs="Times New Roman"/>
         </w:rPr>
-        <w:t xml:space="preserve">The trained model files are stored directly inside the backend and are loaded locally when the application starts. This means the backend hosts both the API and the machine learning </w:t>
-      </w:r>
-      <w:proofErr w:type="gramStart"/>
-      <w:r>
-        <w:rPr>
-          <w:rFonts w:ascii="Times New Roman" w:hAnsi="Times New Roman" w:cs="Times New Roman"/>
-        </w:rPr>
-        <w:t>models</w:t>
-      </w:r>
-      <w:proofErr w:type="gramEnd"/>
-      <w:r>
-        <w:rPr>
-          <w:rFonts w:ascii="Times New Roman" w:hAnsi="Times New Roman" w:cs="Times New Roman"/>
-        </w:rPr>
-        <w:t>, creating a self-contained deployment.</w:t>
+        <w:t>The trained model files are stored directly inside the backend and are loaded locally when the application starts. This means the backend hosts both the API and the machine learning models, creating a self-contained deployment.</w:t>
       </w:r>
     </w:p>
     <w:p>
@@ -3257,7 +3567,6 @@
           <w:b/>
           <w:bCs/>
         </w:rPr>
-        <w:lastRenderedPageBreak/>
         <w:t>Reflection and Future Improvements</w:t>
       </w:r>
       <w:bookmarkEnd w:id="10"/>
@@ -3420,6 +3729,7 @@
         <w:rPr>
           <w:rFonts w:ascii="Times New Roman" w:hAnsi="Times New Roman" w:cs="Times New Roman"/>
         </w:rPr>
+        <w:lastRenderedPageBreak/>
         <w:t>Using a vector database if the catalogue grows significantly.</w:t>
       </w:r>
     </w:p>
@@ -3467,35 +3777,7 @@
         <w:rPr>
           <w:rFonts w:ascii="Times New Roman" w:hAnsi="Times New Roman" w:cs="Times New Roman"/>
         </w:rPr>
-        <w:t xml:space="preserve">A longer-term improvement would be retraining the style classifier as a multi-label model. The current classifier predicts only one style category, while fashion items often belong to multiple aesthetics at the same time. This would require additional </w:t>
-      </w:r>
-      <w:proofErr w:type="gramStart"/>
-      <w:r>
-        <w:rPr>
-          <w:rFonts w:ascii="Times New Roman" w:hAnsi="Times New Roman" w:cs="Times New Roman"/>
-        </w:rPr>
-        <w:t>dataset</w:t>
-      </w:r>
-      <w:proofErr w:type="gramEnd"/>
-      <w:r>
-        <w:rPr>
-          <w:rFonts w:ascii="Times New Roman" w:hAnsi="Times New Roman" w:cs="Times New Roman"/>
-        </w:rPr>
-        <w:t xml:space="preserve"> labelling and further </w:t>
-      </w:r>
-      <w:proofErr w:type="gramStart"/>
-      <w:r>
-        <w:rPr>
-          <w:rFonts w:ascii="Times New Roman" w:hAnsi="Times New Roman" w:cs="Times New Roman"/>
-        </w:rPr>
-        <w:t>evaluation, but</w:t>
-      </w:r>
-      <w:proofErr w:type="gramEnd"/>
-      <w:r>
-        <w:rPr>
-          <w:rFonts w:ascii="Times New Roman" w:hAnsi="Times New Roman" w:cs="Times New Roman"/>
-        </w:rPr>
-        <w:t xml:space="preserve"> could improve recommendation quality for ambiguous garments.</w:t>
+        <w:t>A longer-term improvement would be retraining the style classifier as a multi-label model. The current classifier predicts only one style category, while fashion items often belong to multiple aesthetics at the same time. This would require additional dataset labelling and further evaluation, but could improve recommendation quality for ambiguous garments.</w:t>
       </w:r>
     </w:p>
     <w:p>
@@ -3522,7 +3804,6 @@
         </w:rPr>
       </w:pPr>
       <w:bookmarkStart w:id="11" w:name="_Toc231749854"/>
-      <w:proofErr w:type="gramStart"/>
       <w:r>
         <w:rPr>
           <w:rFonts w:ascii="Times New Roman" w:hAnsi="Times New Roman" w:cs="Times New Roman"/>
@@ -3532,7 +3813,6 @@
         <w:t>Final Conclusion</w:t>
       </w:r>
       <w:bookmarkEnd w:id="11"/>
-      <w:proofErr w:type="gramEnd"/>
     </w:p>
     <w:p>
       <w:pPr>
@@ -3557,7 +3837,6 @@
         <w:rPr>
           <w:rFonts w:ascii="Times New Roman" w:hAnsi="Times New Roman" w:cs="Times New Roman"/>
         </w:rPr>
-        <w:lastRenderedPageBreak/>
         <w:t>Throughout development, the application evolved beyond a simple model showcase. Features such as upload validation, reliability handling, multi-style recommendations, and item replacement were added to improve both recommendation quality and user experience. The frontend was also refined to present the results in a way that is easier to understand and more aligned with the fashion domain.</w:t>
       </w:r>
     </w:p>
@@ -3616,7 +3895,7 @@
       </w:pPr>
     </w:p>
     <w:sectPr>
-      <w:footerReference w:type="default" r:id="rId11"/>
+      <w:footerReference w:type="default" r:id="rId19"/>
       <w:pgSz w:w="12240" w:h="15840"/>
       <w:pgMar w:top="720" w:right="720" w:bottom="720" w:left="720" w:header="708" w:footer="708" w:gutter="0"/>
       <w:pgBorders w:offsetFrom="page">
@@ -5428,6 +5707,7 @@
   <w:style w:type="character" w:default="1" w:styleId="DefaultParagraphFont">
     <w:name w:val="Default Paragraph Font"/>
     <w:uiPriority w:val="1"/>
+    <w:semiHidden/>
     <w:unhideWhenUsed/>
   </w:style>
   <w:style w:type="table" w:default="1" w:styleId="TableNormal">

</xml_diff>

<commit_message>
Updated the Application Development document
</commit_message>
<xml_diff>
--- a/docs/Application Development Report.docx
+++ b/docs/Application Development Report.docx
@@ -811,15 +811,7 @@
     </w:sdt>
     <w:sdt>
       <w:sdtPr>
-        <w:rPr>
-          <w:rFonts w:asciiTheme="minorHAnsi" w:eastAsiaTheme="minorHAnsi" w:hAnsiTheme="minorHAnsi" w:cstheme="minorBidi"/>
-          <w:color w:val="auto"/>
-          <w:kern w:val="2"/>
-          <w:sz w:val="24"/>
-          <w:szCs w:val="24"/>
-          <w14:ligatures w14:val="standardContextual"/>
-        </w:rPr>
-        <w:id w:val="-1854862105"/>
+        <w:id w:val="236529085"/>
         <w:docPartObj>
           <w:docPartGallery w:val="Table of Contents"/>
           <w:docPartUnique/>
@@ -827,12 +819,23 @@
       </w:sdtPr>
       <w:sdtEndPr>
         <w:rPr>
+          <w:rFonts w:asciiTheme="minorHAnsi" w:eastAsiaTheme="minorHAnsi" w:hAnsiTheme="minorHAnsi" w:cstheme="minorBidi"/>
           <w:b/>
           <w:bCs/>
           <w:noProof/>
+          <w:color w:val="auto"/>
+          <w:kern w:val="2"/>
+          <w:sz w:val="24"/>
+          <w:szCs w:val="24"/>
+          <w14:ligatures w14:val="standardContextual"/>
         </w:rPr>
       </w:sdtEndPr>
       <w:sdtContent>
+        <w:p>
+          <w:pPr>
+            <w:pStyle w:val="TOCHeading"/>
+          </w:pPr>
+        </w:p>
         <w:p>
           <w:pPr>
             <w:pStyle w:val="TOCHeading"/>
@@ -878,6 +881,7 @@
               <w:tab w:val="right" w:leader="dot" w:pos="10790"/>
             </w:tabs>
             <w:rPr>
+              <w:rFonts w:eastAsiaTheme="minorEastAsia"/>
               <w:noProof/>
             </w:rPr>
           </w:pPr>
@@ -890,7 +894,7 @@
           <w:r>
             <w:fldChar w:fldCharType="separate"/>
           </w:r>
-          <w:hyperlink w:anchor="_Toc231749843" w:history="1">
+          <w:hyperlink w:anchor="_Toc232515572" w:history="1">
             <w:r>
               <w:rPr>
                 <w:rStyle w:val="Hyperlink"/>
@@ -920,7 +924,7 @@
                 <w:noProof/>
                 <w:webHidden/>
               </w:rPr>
-              <w:instrText xml:space="preserve"> PAGEREF _Toc231749843 \h </w:instrText>
+              <w:instrText xml:space="preserve"> PAGEREF _Toc232515572 \h </w:instrText>
             </w:r>
             <w:r>
               <w:rPr>
@@ -958,10 +962,11 @@
               <w:tab w:val="right" w:leader="dot" w:pos="10790"/>
             </w:tabs>
             <w:rPr>
+              <w:rFonts w:eastAsiaTheme="minorEastAsia"/>
               <w:noProof/>
             </w:rPr>
           </w:pPr>
-          <w:hyperlink w:anchor="_Toc231749844" w:history="1">
+          <w:hyperlink w:anchor="_Toc232515573" w:history="1">
             <w:r>
               <w:rPr>
                 <w:rStyle w:val="Hyperlink"/>
@@ -991,7 +996,7 @@
                 <w:noProof/>
                 <w:webHidden/>
               </w:rPr>
-              <w:instrText xml:space="preserve"> PAGEREF _Toc231749844 \h </w:instrText>
+              <w:instrText xml:space="preserve"> PAGEREF _Toc232515573 \h </w:instrText>
             </w:r>
             <w:r>
               <w:rPr>
@@ -1029,10 +1034,11 @@
               <w:tab w:val="right" w:leader="dot" w:pos="10790"/>
             </w:tabs>
             <w:rPr>
+              <w:rFonts w:eastAsiaTheme="minorEastAsia"/>
               <w:noProof/>
             </w:rPr>
           </w:pPr>
-          <w:hyperlink w:anchor="_Toc231749845" w:history="1">
+          <w:hyperlink w:anchor="_Toc232515574" w:history="1">
             <w:r>
               <w:rPr>
                 <w:rStyle w:val="Hyperlink"/>
@@ -1062,7 +1068,7 @@
                 <w:noProof/>
                 <w:webHidden/>
               </w:rPr>
-              <w:instrText xml:space="preserve"> PAGEREF _Toc231749845 \h </w:instrText>
+              <w:instrText xml:space="preserve"> PAGEREF _Toc232515574 \h </w:instrText>
             </w:r>
             <w:r>
               <w:rPr>
@@ -1100,10 +1106,11 @@
               <w:tab w:val="right" w:leader="dot" w:pos="10790"/>
             </w:tabs>
             <w:rPr>
+              <w:rFonts w:eastAsiaTheme="minorEastAsia"/>
               <w:noProof/>
             </w:rPr>
           </w:pPr>
-          <w:hyperlink w:anchor="_Toc231749846" w:history="1">
+          <w:hyperlink w:anchor="_Toc232515575" w:history="1">
             <w:r>
               <w:rPr>
                 <w:rStyle w:val="Hyperlink"/>
@@ -1133,7 +1140,7 @@
                 <w:noProof/>
                 <w:webHidden/>
               </w:rPr>
-              <w:instrText xml:space="preserve"> PAGEREF _Toc231749846 \h </w:instrText>
+              <w:instrText xml:space="preserve"> PAGEREF _Toc232515575 \h </w:instrText>
             </w:r>
             <w:r>
               <w:rPr>
@@ -1171,10 +1178,11 @@
               <w:tab w:val="right" w:leader="dot" w:pos="10790"/>
             </w:tabs>
             <w:rPr>
+              <w:rFonts w:eastAsiaTheme="minorEastAsia"/>
               <w:noProof/>
             </w:rPr>
           </w:pPr>
-          <w:hyperlink w:anchor="_Toc231749847" w:history="1">
+          <w:hyperlink w:anchor="_Toc232515576" w:history="1">
             <w:r>
               <w:rPr>
                 <w:rStyle w:val="Hyperlink"/>
@@ -1204,7 +1212,7 @@
                 <w:noProof/>
                 <w:webHidden/>
               </w:rPr>
-              <w:instrText xml:space="preserve"> PAGEREF _Toc231749847 \h </w:instrText>
+              <w:instrText xml:space="preserve"> PAGEREF _Toc232515576 \h </w:instrText>
             </w:r>
             <w:r>
               <w:rPr>
@@ -1224,7 +1232,7 @@
                 <w:noProof/>
                 <w:webHidden/>
               </w:rPr>
-              <w:t>3</w:t>
+              <w:t>4</w:t>
             </w:r>
             <w:r>
               <w:rPr>
@@ -1242,10 +1250,11 @@
               <w:tab w:val="right" w:leader="dot" w:pos="10790"/>
             </w:tabs>
             <w:rPr>
+              <w:rFonts w:eastAsiaTheme="minorEastAsia"/>
               <w:noProof/>
             </w:rPr>
           </w:pPr>
-          <w:hyperlink w:anchor="_Toc231749848" w:history="1">
+          <w:hyperlink w:anchor="_Toc232515577" w:history="1">
             <w:r>
               <w:rPr>
                 <w:rStyle w:val="Hyperlink"/>
@@ -1275,7 +1284,7 @@
                 <w:noProof/>
                 <w:webHidden/>
               </w:rPr>
-              <w:instrText xml:space="preserve"> PAGEREF _Toc231749848 \h </w:instrText>
+              <w:instrText xml:space="preserve"> PAGEREF _Toc232515577 \h </w:instrText>
             </w:r>
             <w:r>
               <w:rPr>
@@ -1295,7 +1304,7 @@
                 <w:noProof/>
                 <w:webHidden/>
               </w:rPr>
-              <w:t>3</w:t>
+              <w:t>5</w:t>
             </w:r>
             <w:r>
               <w:rPr>
@@ -1313,10 +1322,11 @@
               <w:tab w:val="right" w:leader="dot" w:pos="10790"/>
             </w:tabs>
             <w:rPr>
+              <w:rFonts w:eastAsiaTheme="minorEastAsia"/>
               <w:noProof/>
             </w:rPr>
           </w:pPr>
-          <w:hyperlink w:anchor="_Toc231749849" w:history="1">
+          <w:hyperlink w:anchor="_Toc232515578" w:history="1">
             <w:r>
               <w:rPr>
                 <w:rStyle w:val="Hyperlink"/>
@@ -1325,7 +1335,7 @@
                 <w:bCs/>
                 <w:noProof/>
               </w:rPr>
-              <w:t>Multi-Style Recommendations</w:t>
+              <w:t>Multi-Style Recommendations and Recommendation Mode Selector</w:t>
             </w:r>
             <w:r>
               <w:rPr>
@@ -1346,7 +1356,7 @@
                 <w:noProof/>
                 <w:webHidden/>
               </w:rPr>
-              <w:instrText xml:space="preserve"> PAGEREF _Toc231749849 \h </w:instrText>
+              <w:instrText xml:space="preserve"> PAGEREF _Toc232515578 \h </w:instrText>
             </w:r>
             <w:r>
               <w:rPr>
@@ -1366,7 +1376,7 @@
                 <w:noProof/>
                 <w:webHidden/>
               </w:rPr>
-              <w:t>4</w:t>
+              <w:t>6</w:t>
             </w:r>
             <w:r>
               <w:rPr>
@@ -1384,10 +1394,11 @@
               <w:tab w:val="right" w:leader="dot" w:pos="10790"/>
             </w:tabs>
             <w:rPr>
+              <w:rFonts w:eastAsiaTheme="minorEastAsia"/>
               <w:noProof/>
             </w:rPr>
           </w:pPr>
-          <w:hyperlink w:anchor="_Toc231749850" w:history="1">
+          <w:hyperlink w:anchor="_Toc232515579" w:history="1">
             <w:r>
               <w:rPr>
                 <w:rStyle w:val="Hyperlink"/>
@@ -1417,7 +1428,7 @@
                 <w:noProof/>
                 <w:webHidden/>
               </w:rPr>
-              <w:instrText xml:space="preserve"> PAGEREF _Toc231749850 \h </w:instrText>
+              <w:instrText xml:space="preserve"> PAGEREF _Toc232515579 \h </w:instrText>
             </w:r>
             <w:r>
               <w:rPr>
@@ -1437,7 +1448,7 @@
                 <w:noProof/>
                 <w:webHidden/>
               </w:rPr>
-              <w:t>4</w:t>
+              <w:t>8</w:t>
             </w:r>
             <w:r>
               <w:rPr>
@@ -1455,10 +1466,11 @@
               <w:tab w:val="right" w:leader="dot" w:pos="10790"/>
             </w:tabs>
             <w:rPr>
+              <w:rFonts w:eastAsiaTheme="minorEastAsia"/>
               <w:noProof/>
             </w:rPr>
           </w:pPr>
-          <w:hyperlink w:anchor="_Toc231749851" w:history="1">
+          <w:hyperlink w:anchor="_Toc232515580" w:history="1">
             <w:r>
               <w:rPr>
                 <w:rStyle w:val="Hyperlink"/>
@@ -1488,7 +1500,7 @@
                 <w:noProof/>
                 <w:webHidden/>
               </w:rPr>
-              <w:instrText xml:space="preserve"> PAGEREF _Toc231749851 \h </w:instrText>
+              <w:instrText xml:space="preserve"> PAGEREF _Toc232515580 \h </w:instrText>
             </w:r>
             <w:r>
               <w:rPr>
@@ -1508,7 +1520,7 @@
                 <w:noProof/>
                 <w:webHidden/>
               </w:rPr>
-              <w:t>5</w:t>
+              <w:t>8</w:t>
             </w:r>
             <w:r>
               <w:rPr>
@@ -1526,10 +1538,11 @@
               <w:tab w:val="right" w:leader="dot" w:pos="10790"/>
             </w:tabs>
             <w:rPr>
+              <w:rFonts w:eastAsiaTheme="minorEastAsia"/>
               <w:noProof/>
             </w:rPr>
           </w:pPr>
-          <w:hyperlink w:anchor="_Toc231749852" w:history="1">
+          <w:hyperlink w:anchor="_Toc232515581" w:history="1">
             <w:r>
               <w:rPr>
                 <w:rStyle w:val="Hyperlink"/>
@@ -1559,7 +1572,7 @@
                 <w:noProof/>
                 <w:webHidden/>
               </w:rPr>
-              <w:instrText xml:space="preserve"> PAGEREF _Toc231749852 \h </w:instrText>
+              <w:instrText xml:space="preserve"> PAGEREF _Toc232515581 \h </w:instrText>
             </w:r>
             <w:r>
               <w:rPr>
@@ -1579,7 +1592,7 @@
                 <w:noProof/>
                 <w:webHidden/>
               </w:rPr>
-              <w:t>6</w:t>
+              <w:t>10</w:t>
             </w:r>
             <w:r>
               <w:rPr>
@@ -1597,10 +1610,11 @@
               <w:tab w:val="right" w:leader="dot" w:pos="10790"/>
             </w:tabs>
             <w:rPr>
+              <w:rFonts w:eastAsiaTheme="minorEastAsia"/>
               <w:noProof/>
             </w:rPr>
           </w:pPr>
-          <w:hyperlink w:anchor="_Toc231749853" w:history="1">
+          <w:hyperlink w:anchor="_Toc232515582" w:history="1">
             <w:r>
               <w:rPr>
                 <w:rStyle w:val="Hyperlink"/>
@@ -1630,7 +1644,7 @@
                 <w:noProof/>
                 <w:webHidden/>
               </w:rPr>
-              <w:instrText xml:space="preserve"> PAGEREF _Toc231749853 \h </w:instrText>
+              <w:instrText xml:space="preserve"> PAGEREF _Toc232515582 \h </w:instrText>
             </w:r>
             <w:r>
               <w:rPr>
@@ -1650,7 +1664,7 @@
                 <w:noProof/>
                 <w:webHidden/>
               </w:rPr>
-              <w:t>7</w:t>
+              <w:t>11</w:t>
             </w:r>
             <w:r>
               <w:rPr>
@@ -1668,10 +1682,11 @@
               <w:tab w:val="right" w:leader="dot" w:pos="10790"/>
             </w:tabs>
             <w:rPr>
+              <w:rFonts w:eastAsiaTheme="minorEastAsia"/>
               <w:noProof/>
             </w:rPr>
           </w:pPr>
-          <w:hyperlink w:anchor="_Toc231749854" w:history="1">
+          <w:hyperlink w:anchor="_Toc232515583" w:history="1">
             <w:r>
               <w:rPr>
                 <w:rStyle w:val="Hyperlink"/>
@@ -1701,7 +1716,7 @@
                 <w:noProof/>
                 <w:webHidden/>
               </w:rPr>
-              <w:instrText xml:space="preserve"> PAGEREF _Toc231749854 \h </w:instrText>
+              <w:instrText xml:space="preserve"> PAGEREF _Toc232515583 \h </w:instrText>
             </w:r>
             <w:r>
               <w:rPr>
@@ -1721,7 +1736,7 @@
                 <w:noProof/>
                 <w:webHidden/>
               </w:rPr>
-              <w:t>7</w:t>
+              <w:t>12</w:t>
             </w:r>
             <w:r>
               <w:rPr>
@@ -1750,13 +1765,6 @@
           <w:rFonts w:ascii="Times New Roman" w:hAnsi="Times New Roman" w:cs="Times New Roman"/>
         </w:rPr>
       </w:pPr>
-    </w:p>
-    <w:p>
-      <w:pPr>
-        <w:rPr>
-          <w:rFonts w:ascii="Times New Roman" w:hAnsi="Times New Roman" w:cs="Times New Roman"/>
-        </w:rPr>
-      </w:pPr>
       <w:r>
         <w:rPr>
           <w:rFonts w:ascii="Times New Roman" w:hAnsi="Times New Roman" w:cs="Times New Roman"/>
@@ -1775,6 +1783,7 @@
         </w:rPr>
       </w:pPr>
       <w:bookmarkStart w:id="0" w:name="_Toc231749843"/>
+      <w:bookmarkStart w:id="1" w:name="_Toc232515572"/>
       <w:r>
         <w:rPr>
           <w:rFonts w:ascii="Times New Roman" w:hAnsi="Times New Roman" w:cs="Times New Roman"/>
@@ -1785,6 +1794,7 @@
         <w:t>Introduction</w:t>
       </w:r>
       <w:bookmarkEnd w:id="0"/>
+      <w:bookmarkEnd w:id="1"/>
     </w:p>
     <w:p>
       <w:pPr>
@@ -1822,7 +1832,22 @@
         <w:rPr>
           <w:rFonts w:ascii="Times New Roman" w:hAnsi="Times New Roman" w:cs="Times New Roman"/>
         </w:rPr>
-        <w:t>The app connects the selected models from the experiments: MobileNetV3 Large for style classification, the improved ResNet34 model for clothing type classification, and CLIP embeddings for recommendation ranking.</w:t>
+        <w:t>The app connects the selected models from the experiments:</w:t>
+      </w:r>
+      <w:r>
+        <w:t xml:space="preserve"> </w:t>
+      </w:r>
+      <w:r>
+        <w:rPr>
+          <w:rFonts w:ascii="Times New Roman" w:hAnsi="Times New Roman" w:cs="Times New Roman"/>
+        </w:rPr>
+        <w:t>multi-label MobileNetV3 Large for style classification</w:t>
+      </w:r>
+      <w:r>
+        <w:rPr>
+          <w:rFonts w:ascii="Times New Roman" w:hAnsi="Times New Roman" w:cs="Times New Roman"/>
+        </w:rPr>
+        <w:t>, the improved ResNet34 model for clothing type classification, and CLIP embeddings for recommendation ranking.</w:t>
       </w:r>
     </w:p>
     <w:p>
@@ -1848,7 +1873,8 @@
           <w:bCs/>
         </w:rPr>
       </w:pPr>
-      <w:bookmarkStart w:id="1" w:name="_Toc231749844"/>
+      <w:bookmarkStart w:id="2" w:name="_Toc231749844"/>
+      <w:bookmarkStart w:id="3" w:name="_Toc232515573"/>
       <w:r>
         <w:rPr>
           <w:rFonts w:ascii="Times New Roman" w:hAnsi="Times New Roman" w:cs="Times New Roman"/>
@@ -1857,7 +1883,8 @@
         </w:rPr>
         <w:t>Application Overview</w:t>
       </w:r>
-      <w:bookmarkEnd w:id="1"/>
+      <w:bookmarkEnd w:id="2"/>
+      <w:bookmarkEnd w:id="3"/>
     </w:p>
     <w:p>
       <w:pPr>
@@ -1964,7 +1991,13 @@
         <w:pStyle w:val="NormalWeb"/>
       </w:pPr>
       <w:r>
-        <w:t>The final prototype uses MobileNetV3 Large for style classification, an improved ResNet34 model for clothing type classification, and CLIP embeddings with cosine similarity for recommendation ranking.</w:t>
+        <w:t xml:space="preserve">The final prototype uses </w:t>
+      </w:r>
+      <w:r>
+        <w:t>multi-label MobileNetV3 Large for style classification</w:t>
+      </w:r>
+      <w:r>
+        <w:t>, an improved ResNet34 model for clothing type classification, and CLIP embeddings with cosine similarity for recommendation ranking.</w:t>
       </w:r>
     </w:p>
     <w:p>
@@ -1977,7 +2010,8 @@
           <w:bCs/>
         </w:rPr>
       </w:pPr>
-      <w:bookmarkStart w:id="2" w:name="_Toc231749845"/>
+      <w:bookmarkStart w:id="4" w:name="_Toc231749845"/>
+      <w:bookmarkStart w:id="5" w:name="_Toc232515574"/>
       <w:r>
         <w:rPr>
           <w:rFonts w:ascii="Times New Roman" w:hAnsi="Times New Roman" w:cs="Times New Roman"/>
@@ -1986,7 +2020,8 @@
         </w:rPr>
         <w:t>Core Features and Development Improvements</w:t>
       </w:r>
-      <w:bookmarkEnd w:id="2"/>
+      <w:bookmarkEnd w:id="4"/>
+      <w:bookmarkEnd w:id="5"/>
     </w:p>
     <w:p>
       <w:pPr>
@@ -1998,7 +2033,8 @@
           <w:bCs/>
         </w:rPr>
       </w:pPr>
-      <w:bookmarkStart w:id="3" w:name="_Toc231749846"/>
+      <w:bookmarkStart w:id="6" w:name="_Toc231749846"/>
+      <w:bookmarkStart w:id="7" w:name="_Toc232515575"/>
       <w:r>
         <w:rPr>
           <w:rFonts w:ascii="Times New Roman" w:hAnsi="Times New Roman" w:cs="Times New Roman"/>
@@ -2007,7 +2043,8 @@
         </w:rPr>
         <w:t>Image Upload Validation</w:t>
       </w:r>
-      <w:bookmarkEnd w:id="3"/>
+      <w:bookmarkEnd w:id="6"/>
+      <w:bookmarkEnd w:id="7"/>
     </w:p>
     <w:p>
       <w:pPr>
@@ -2046,7 +2083,31 @@
         <w:rPr>
           <w:rFonts w:ascii="Times New Roman" w:hAnsi="Times New Roman" w:cs="Times New Roman"/>
         </w:rPr>
-        <w:t>, the backend performs several validation checks. Only JPG and PNG files are accepted, empty files are rejected, file size is limited to 8 MB, and images must be readable by the application. Very small images are also rejected because they often do not contain enough visual information for reliable predictions.</w:t>
+        <w:t>, the backend performs several validation checks. Only JPG</w:t>
+      </w:r>
+      <w:r>
+        <w:rPr>
+          <w:rFonts w:ascii="Times New Roman" w:hAnsi="Times New Roman" w:cs="Times New Roman"/>
+        </w:rPr>
+        <w:t>,</w:t>
+      </w:r>
+      <w:r>
+        <w:rPr>
+          <w:rFonts w:ascii="Times New Roman" w:hAnsi="Times New Roman" w:cs="Times New Roman"/>
+        </w:rPr>
+        <w:t xml:space="preserve"> PNG</w:t>
+      </w:r>
+      <w:r>
+        <w:rPr>
+          <w:rFonts w:ascii="Times New Roman" w:hAnsi="Times New Roman" w:cs="Times New Roman"/>
+        </w:rPr>
+        <w:t>, and WEBP</w:t>
+      </w:r>
+      <w:r>
+        <w:rPr>
+          <w:rFonts w:ascii="Times New Roman" w:hAnsi="Times New Roman" w:cs="Times New Roman"/>
+        </w:rPr>
+        <w:t xml:space="preserve"> files are accepted, empty files are rejected, file size is limited to 8 MB, and images must be readable by the application. Very small images are also rejected because they often do not contain enough visual information for reliable predictions.</w:t>
       </w:r>
     </w:p>
     <w:p>
@@ -2091,6 +2152,7 @@
       <w:r>
         <w:rPr>
           <w:rFonts w:ascii="Times New Roman" w:hAnsi="Times New Roman" w:cs="Times New Roman"/>
+          <w:noProof/>
         </w:rPr>
         <w:drawing>
           <wp:inline distT="0" distB="0" distL="0" distR="0" wp14:anchorId="59B196EB" wp14:editId="2A18FC42">
@@ -2138,6 +2200,7 @@
       <w:r>
         <w:rPr>
           <w:rFonts w:ascii="Times New Roman" w:hAnsi="Times New Roman" w:cs="Times New Roman"/>
+          <w:noProof/>
         </w:rPr>
         <w:lastRenderedPageBreak/>
         <w:drawing>
@@ -2186,6 +2249,7 @@
       <w:r>
         <w:rPr>
           <w:rFonts w:ascii="Times New Roman" w:hAnsi="Times New Roman" w:cs="Times New Roman"/>
+          <w:noProof/>
         </w:rPr>
         <w:drawing>
           <wp:inline distT="0" distB="0" distL="0" distR="0" wp14:anchorId="0CA605A7" wp14:editId="628B4608">
@@ -2234,7 +2298,8 @@
           <w:bCs/>
         </w:rPr>
       </w:pPr>
-      <w:bookmarkStart w:id="4" w:name="_Toc231749847"/>
+      <w:bookmarkStart w:id="8" w:name="_Toc231749847"/>
+      <w:bookmarkStart w:id="9" w:name="_Toc232515576"/>
       <w:r>
         <w:rPr>
           <w:rFonts w:ascii="Times New Roman" w:hAnsi="Times New Roman" w:cs="Times New Roman"/>
@@ -2243,7 +2308,8 @@
         </w:rPr>
         <w:t>Garment Analysis</w:t>
       </w:r>
-      <w:bookmarkEnd w:id="4"/>
+      <w:bookmarkEnd w:id="8"/>
+      <w:bookmarkEnd w:id="9"/>
     </w:p>
     <w:p>
       <w:pPr>
@@ -2268,7 +2334,7 @@
         <w:rPr>
           <w:rFonts w:ascii="Times New Roman" w:hAnsi="Times New Roman" w:cs="Times New Roman"/>
         </w:rPr>
-        <w:t>The first model predicts the fashion aesthetic of the item. The possible styles are formal, gothic, sporty, and streetwear. The second model predicts the garment type, which can be a jacket, pants, shoes, or t-shirt.</w:t>
+        <w:t>The first model predicts the possible fashion aesthetics of the item. The supported aesthetics are formal, gothic, sporty, and streetwear. In the final version of the application, the style model uses a multi-label setup instead of forcing every garment into only one aesthetic. This is important because fashion items can contain overlapping style characteristics. For example, one garment can look both sporty and streetwear at the same time.</w:t>
       </w:r>
     </w:p>
     <w:p>
@@ -2282,113 +2348,76 @@
           <w:rFonts w:ascii="Times New Roman" w:hAnsi="Times New Roman" w:cs="Times New Roman"/>
         </w:rPr>
         <w:lastRenderedPageBreak/>
-        <w:t>Besides the predictions themselves, the application also calculates confidence scores. These scores indicate how certain the models are about their predictions. Instead of hiding this information, it is presented to the user as part of the analysis process.</w:t>
-      </w:r>
-    </w:p>
-    <w:p>
-      <w:pPr>
-        <w:rPr>
-          <w:rFonts w:ascii="Times New Roman" w:hAnsi="Times New Roman" w:cs="Times New Roman"/>
-        </w:rPr>
-      </w:pPr>
-      <w:r>
-        <w:rPr>
-          <w:rFonts w:ascii="Times New Roman" w:hAnsi="Times New Roman" w:cs="Times New Roman"/>
-        </w:rPr>
-        <w:t>To make the results easier to understand, the backend also calculates a reliability level:</w:t>
-      </w:r>
-    </w:p>
-    <w:p>
-      <w:pPr>
-        <w:numPr>
-          <w:ilvl w:val="0"/>
-          <w:numId w:val="3"/>
-        </w:numPr>
-        <w:rPr>
-          <w:rFonts w:ascii="Times New Roman" w:hAnsi="Times New Roman" w:cs="Times New Roman"/>
-        </w:rPr>
-      </w:pPr>
-      <w:r>
-        <w:rPr>
-          <w:rFonts w:ascii="Times New Roman" w:hAnsi="Times New Roman" w:cs="Times New Roman"/>
-        </w:rPr>
-        <w:t>High reliability: both predictions have confidence above 80%.</w:t>
-      </w:r>
-    </w:p>
-    <w:p>
-      <w:pPr>
-        <w:numPr>
-          <w:ilvl w:val="0"/>
-          <w:numId w:val="3"/>
-        </w:numPr>
-        <w:rPr>
-          <w:rFonts w:ascii="Times New Roman" w:hAnsi="Times New Roman" w:cs="Times New Roman"/>
-        </w:rPr>
-      </w:pPr>
-      <w:r>
-        <w:rPr>
-          <w:rFonts w:ascii="Times New Roman" w:hAnsi="Times New Roman" w:cs="Times New Roman"/>
-        </w:rPr>
-        <w:t>Medium reliability: both predictions have confidence above 60%.</w:t>
-      </w:r>
-    </w:p>
-    <w:p>
-      <w:pPr>
-        <w:numPr>
-          <w:ilvl w:val="0"/>
-          <w:numId w:val="3"/>
-        </w:numPr>
-        <w:rPr>
-          <w:rFonts w:ascii="Times New Roman" w:hAnsi="Times New Roman" w:cs="Times New Roman"/>
-        </w:rPr>
-      </w:pPr>
-      <w:r>
-        <w:rPr>
-          <w:rFonts w:ascii="Times New Roman" w:hAnsi="Times New Roman" w:cs="Times New Roman"/>
-        </w:rPr>
-        <w:t>Low reliability: one or both predictions have lower confidence.</w:t>
-      </w:r>
-    </w:p>
-    <w:p>
-      <w:pPr>
-        <w:rPr>
-          <w:rFonts w:ascii="Times New Roman" w:hAnsi="Times New Roman" w:cs="Times New Roman"/>
-        </w:rPr>
-      </w:pPr>
-      <w:r>
-        <w:rPr>
-          <w:rFonts w:ascii="Times New Roman" w:hAnsi="Times New Roman" w:cs="Times New Roman"/>
-        </w:rPr>
-        <w:t>Low reliability does not mean the prediction is incorrect. It simply indicates that the result should be interpreted more carefully because the model was less certain about its decision.</w:t>
-      </w:r>
-    </w:p>
-    <w:p>
-      <w:pPr>
-        <w:rPr>
-          <w:rFonts w:ascii="Times New Roman" w:hAnsi="Times New Roman" w:cs="Times New Roman"/>
-        </w:rPr>
-      </w:pPr>
-      <w:r>
-        <w:rPr>
-          <w:rFonts w:ascii="Times New Roman" w:hAnsi="Times New Roman" w:cs="Times New Roman"/>
-        </w:rPr>
-        <w:t>The analysis results are presented in the interface through a garment profile that summarizes the detected style, garment type, confidence scores, and reliability level. This provides users with a clear overview of how the system interpreted their uploaded item before generating recommendations.</w:t>
-      </w:r>
-    </w:p>
-    <w:p>
-      <w:pPr>
-        <w:rPr>
-          <w:rFonts w:ascii="Times New Roman" w:hAnsi="Times New Roman" w:cs="Times New Roman"/>
-        </w:rPr>
-      </w:pPr>
-      <w:r>
-        <w:rPr>
-          <w:rFonts w:ascii="Times New Roman" w:hAnsi="Times New Roman" w:cs="Times New Roman"/>
+        <w:t>The multi-label style model uses sigmoid outputs and a selected threshold to decide which aesthetics should be included in the selected style pool. If one or more styles pass the threshold, they are selected as possible aesthetic directions for the recommendation system. If no style passes the threshold, the system falls back to the highest scoring style. This prevents the application from returning an empty style result while still supporting ambiguous garments.</w:t>
+      </w:r>
+    </w:p>
+    <w:p>
+      <w:pPr>
+        <w:rPr>
+          <w:rFonts w:ascii="Times New Roman" w:hAnsi="Times New Roman" w:cs="Times New Roman"/>
+        </w:rPr>
+      </w:pPr>
+      <w:r>
+        <w:rPr>
+          <w:rFonts w:ascii="Times New Roman" w:hAnsi="Times New Roman" w:cs="Times New Roman"/>
+        </w:rPr>
+        <w:t>The second model predicts the garment type, which can be a jacket, pants, shoes, or t-shirt. This prediction is used to avoid recommending the same garment category as the uploaded item. For example, if the uploaded garment is a jacket, the system focuses on completing the outfit with other item types.</w:t>
+      </w:r>
+    </w:p>
+    <w:p>
+      <w:pPr>
+        <w:rPr>
+          <w:rFonts w:ascii="Times New Roman" w:hAnsi="Times New Roman" w:cs="Times New Roman"/>
+        </w:rPr>
+      </w:pPr>
+      <w:r>
+        <w:rPr>
+          <w:rFonts w:ascii="Times New Roman" w:hAnsi="Times New Roman" w:cs="Times New Roman"/>
+        </w:rPr>
+        <w:t>Besides the predictions themselves, the application also presents confidence scores. These scores help users understand how strongly the model associated the uploaded image with each aesthetic. The interface displays the garment profile, the selected aesthetic pool, the garment type, confidence values, and a reliability level.</w:t>
+      </w:r>
+    </w:p>
+    <w:p>
+      <w:pPr>
+        <w:rPr>
+          <w:rFonts w:ascii="Times New Roman" w:hAnsi="Times New Roman" w:cs="Times New Roman"/>
+        </w:rPr>
+      </w:pPr>
+      <w:r>
+        <w:rPr>
+          <w:rFonts w:ascii="Times New Roman" w:hAnsi="Times New Roman" w:cs="Times New Roman"/>
+        </w:rPr>
+        <w:t>The reliability level helps explain how much trust should be placed in the result. In the final multi-label setup, reliability is interpreted together with the selected threshold. A medium result can still be useful because the selected styles passed the threshold and are then used as input for CLIP-ranked recommendations.</w:t>
+      </w:r>
+    </w:p>
+    <w:p>
+      <w:pPr>
+        <w:rPr>
+          <w:rFonts w:ascii="Times New Roman" w:hAnsi="Times New Roman" w:cs="Times New Roman"/>
+        </w:rPr>
+      </w:pPr>
+      <w:r>
+        <w:rPr>
+          <w:rFonts w:ascii="Times New Roman" w:hAnsi="Times New Roman" w:cs="Times New Roman"/>
+        </w:rPr>
+        <w:t>The analysis results are presented in the interface through a garment profile. This profile summarizes the selected style or style pool, the detected garment type, confidence scores, and reliability level. This gives users a clear overview of how the system interpreted their uploaded item before generating recommendations.</w:t>
+      </w:r>
+    </w:p>
+    <w:p>
+      <w:pPr>
+        <w:rPr>
+          <w:rFonts w:ascii="Times New Roman" w:hAnsi="Times New Roman" w:cs="Times New Roman"/>
+        </w:rPr>
+      </w:pPr>
+      <w:r>
+        <w:rPr>
+          <w:rFonts w:ascii="Times New Roman" w:hAnsi="Times New Roman" w:cs="Times New Roman"/>
+          <w:noProof/>
         </w:rPr>
         <w:drawing>
-          <wp:inline distT="0" distB="0" distL="0" distR="0" wp14:anchorId="7F37C0E8" wp14:editId="469F5337">
-            <wp:extent cx="6858000" cy="3221355"/>
-            <wp:effectExtent l="0" t="0" r="0" b="0"/>
+          <wp:inline distT="0" distB="0" distL="0" distR="0" wp14:anchorId="7F37C0E8" wp14:editId="7BEF0D6D">
+            <wp:extent cx="6492240" cy="3049549"/>
+            <wp:effectExtent l="0" t="0" r="3810" b="0"/>
             <wp:docPr id="264638785" name="Picture 1"/>
             <wp:cNvGraphicFramePr>
               <a:graphicFrameLocks xmlns:a="http://schemas.openxmlformats.org/drawingml/2006/main" noChangeAspect="1"/>
@@ -2409,7 +2438,7 @@
                   <pic:spPr>
                     <a:xfrm>
                       <a:off x="0" y="0"/>
-                      <a:ext cx="6858000" cy="3221355"/>
+                      <a:ext cx="6493207" cy="3050003"/>
                     </a:xfrm>
                     <a:prstGeom prst="rect">
                       <a:avLst/>
@@ -2432,7 +2461,8 @@
           <w:bCs/>
         </w:rPr>
       </w:pPr>
-      <w:bookmarkStart w:id="5" w:name="_Toc231749848"/>
+      <w:bookmarkStart w:id="10" w:name="_Toc231749848"/>
+      <w:bookmarkStart w:id="11" w:name="_Toc232515577"/>
       <w:r>
         <w:rPr>
           <w:rFonts w:ascii="Times New Roman" w:hAnsi="Times New Roman" w:cs="Times New Roman"/>
@@ -2441,7 +2471,8 @@
         </w:rPr>
         <w:t>Recommendation Generation</w:t>
       </w:r>
-      <w:bookmarkEnd w:id="5"/>
+      <w:bookmarkEnd w:id="10"/>
+      <w:bookmarkEnd w:id="11"/>
     </w:p>
     <w:p>
       <w:pPr>
@@ -2493,14 +2524,14 @@
         <w:rPr>
           <w:rFonts w:ascii="Times New Roman" w:hAnsi="Times New Roman" w:cs="Times New Roman"/>
         </w:rPr>
-        <w:t>The recommendation process follows several steps:</w:t>
+        <w:t>The final recommendation process follows several steps:</w:t>
       </w:r>
     </w:p>
     <w:p>
       <w:pPr>
         <w:numPr>
           <w:ilvl w:val="0"/>
-          <w:numId w:val="4"/>
+          <w:numId w:val="9"/>
         </w:numPr>
         <w:rPr>
           <w:rFonts w:ascii="Times New Roman" w:hAnsi="Times New Roman" w:cs="Times New Roman"/>
@@ -2510,6 +2541,7 @@
         <w:rPr>
           <w:rFonts w:ascii="Times New Roman" w:hAnsi="Times New Roman" w:cs="Times New Roman"/>
         </w:rPr>
+        <w:lastRenderedPageBreak/>
         <w:t>Create a CLIP embedding for the uploaded image.</w:t>
       </w:r>
     </w:p>
@@ -2517,7 +2549,7 @@
       <w:pPr>
         <w:numPr>
           <w:ilvl w:val="0"/>
-          <w:numId w:val="4"/>
+          <w:numId w:val="9"/>
         </w:numPr>
         <w:rPr>
           <w:rFonts w:ascii="Times New Roman" w:hAnsi="Times New Roman" w:cs="Times New Roman"/>
@@ -2527,14 +2559,14 @@
         <w:rPr>
           <w:rFonts w:ascii="Times New Roman" w:hAnsi="Times New Roman" w:cs="Times New Roman"/>
         </w:rPr>
-        <w:t>Filter catalogue items based on the predicted style.</w:t>
+        <w:t>Use the multi-label style model to determine the selected aesthetic pool.</w:t>
       </w:r>
     </w:p>
     <w:p>
       <w:pPr>
         <w:numPr>
           <w:ilvl w:val="0"/>
-          <w:numId w:val="4"/>
+          <w:numId w:val="9"/>
         </w:numPr>
         <w:rPr>
           <w:rFonts w:ascii="Times New Roman" w:hAnsi="Times New Roman" w:cs="Times New Roman"/>
@@ -2544,15 +2576,14 @@
         <w:rPr>
           <w:rFonts w:ascii="Times New Roman" w:hAnsi="Times New Roman" w:cs="Times New Roman"/>
         </w:rPr>
-        <w:lastRenderedPageBreak/>
-        <w:t>Exclude items that belong to the same garment type as the uploaded item.</w:t>
+        <w:t>Exclude catalogue items that belong to the same garment type as the uploaded item.</w:t>
       </w:r>
     </w:p>
     <w:p>
       <w:pPr>
         <w:numPr>
           <w:ilvl w:val="0"/>
-          <w:numId w:val="4"/>
+          <w:numId w:val="9"/>
         </w:numPr>
         <w:rPr>
           <w:rFonts w:ascii="Times New Roman" w:hAnsi="Times New Roman" w:cs="Times New Roman"/>
@@ -2562,14 +2593,14 @@
         <w:rPr>
           <w:rFonts w:ascii="Times New Roman" w:hAnsi="Times New Roman" w:cs="Times New Roman"/>
         </w:rPr>
-        <w:t>Compare the uploaded image with the remaining catalogue items using cosine similarity.</w:t>
+        <w:t>Filter catalogue items based on the active style pool.</w:t>
       </w:r>
     </w:p>
     <w:p>
       <w:pPr>
         <w:numPr>
           <w:ilvl w:val="0"/>
-          <w:numId w:val="4"/>
+          <w:numId w:val="9"/>
         </w:numPr>
         <w:rPr>
           <w:rFonts w:ascii="Times New Roman" w:hAnsi="Times New Roman" w:cs="Times New Roman"/>
@@ -2579,14 +2610,14 @@
         <w:rPr>
           <w:rFonts w:ascii="Times New Roman" w:hAnsi="Times New Roman" w:cs="Times New Roman"/>
         </w:rPr>
-        <w:t>Select the most relevant candidates for each clothing category.</w:t>
+        <w:t>Compare the uploaded image with the remaining catalogue items using cosine similarity.</w:t>
       </w:r>
     </w:p>
     <w:p>
       <w:pPr>
         <w:numPr>
           <w:ilvl w:val="0"/>
-          <w:numId w:val="4"/>
+          <w:numId w:val="9"/>
         </w:numPr>
         <w:rPr>
           <w:rFonts w:ascii="Times New Roman" w:hAnsi="Times New Roman" w:cs="Times New Roman"/>
@@ -2596,6 +2627,23 @@
         <w:rPr>
           <w:rFonts w:ascii="Times New Roman" w:hAnsi="Times New Roman" w:cs="Times New Roman"/>
         </w:rPr>
+        <w:t>Select the most visually relevant candidates for each clothing category.</w:t>
+      </w:r>
+    </w:p>
+    <w:p>
+      <w:pPr>
+        <w:numPr>
+          <w:ilvl w:val="0"/>
+          <w:numId w:val="9"/>
+        </w:numPr>
+        <w:rPr>
+          <w:rFonts w:ascii="Times New Roman" w:hAnsi="Times New Roman" w:cs="Times New Roman"/>
+        </w:rPr>
+      </w:pPr>
+      <w:r>
+        <w:rPr>
+          <w:rFonts w:ascii="Times New Roman" w:hAnsi="Times New Roman" w:cs="Times New Roman"/>
+        </w:rPr>
         <w:t>Build outfit suggestions from the selected items.</w:t>
       </w:r>
     </w:p>
@@ -2609,7 +2657,7 @@
         <w:rPr>
           <w:rFonts w:ascii="Times New Roman" w:hAnsi="Times New Roman" w:cs="Times New Roman"/>
         </w:rPr>
-        <w:t>This approach ensures that recommendations are not selected randomly. Instead, they are based on both the predicted aesthetic and the visual characteristics of the uploaded garment.</w:t>
+        <w:t>This approach ensures that recommendations are not selected randomly. Instead, the system combines style classification with visual similarity. The style model determines the possible aesthetic direction or directions, while CLIP ranks catalogue items according to how visually compatible they are with the uploaded garment.</w:t>
       </w:r>
     </w:p>
     <w:p>
@@ -2635,18 +2683,19 @@
         <w:rPr>
           <w:rFonts w:ascii="Times New Roman" w:hAnsi="Times New Roman" w:cs="Times New Roman"/>
         </w:rPr>
-        <w:t>The final result is a recommendation system that combines classification and visual similarity. The classification models determine what kind of item the user uploaded, while CLIP helps identify catalogue items that visually fit the same aesthetic direction.</w:t>
-      </w:r>
-    </w:p>
-    <w:p>
-      <w:pPr>
-        <w:rPr>
-          <w:rFonts w:ascii="Times New Roman" w:hAnsi="Times New Roman" w:cs="Times New Roman"/>
-        </w:rPr>
-      </w:pPr>
-      <w:r>
-        <w:rPr>
-          <w:rFonts w:ascii="Times New Roman" w:hAnsi="Times New Roman" w:cs="Times New Roman"/>
+        <w:t>The final result is a recommendation pipeline where the classification models identify what the user uploaded, while CLIP helps select catalogue items that visually fit the active style pool.</w:t>
+      </w:r>
+    </w:p>
+    <w:p>
+      <w:pPr>
+        <w:rPr>
+          <w:rFonts w:ascii="Times New Roman" w:hAnsi="Times New Roman" w:cs="Times New Roman"/>
+        </w:rPr>
+      </w:pPr>
+      <w:r>
+        <w:rPr>
+          <w:rFonts w:ascii="Times New Roman" w:hAnsi="Times New Roman" w:cs="Times New Roman"/>
+          <w:noProof/>
         </w:rPr>
         <w:drawing>
           <wp:inline distT="0" distB="0" distL="0" distR="0" wp14:anchorId="2B4D748A" wp14:editId="3B2738FD">
@@ -2695,54 +2744,28 @@
           <w:bCs/>
         </w:rPr>
       </w:pPr>
-      <w:bookmarkStart w:id="6" w:name="_Toc231749849"/>
+      <w:bookmarkStart w:id="12" w:name="_Toc232515578"/>
       <w:r>
         <w:rPr>
           <w:rFonts w:ascii="Times New Roman" w:hAnsi="Times New Roman" w:cs="Times New Roman"/>
           <w:b/>
           <w:bCs/>
         </w:rPr>
-        <w:t>Multi-Style Recommendations</w:t>
-      </w:r>
-      <w:bookmarkEnd w:id="6"/>
-    </w:p>
-    <w:p>
-      <w:pPr>
-        <w:rPr>
-          <w:rFonts w:ascii="Times New Roman" w:hAnsi="Times New Roman" w:cs="Times New Roman"/>
-        </w:rPr>
-      </w:pPr>
-      <w:r>
-        <w:rPr>
-          <w:rFonts w:ascii="Times New Roman" w:hAnsi="Times New Roman" w:cs="Times New Roman"/>
-        </w:rPr>
-        <w:t>One of the most recent improvements was the introduction of multi-style recommendations.</w:t>
-      </w:r>
-    </w:p>
-    <w:p>
-      <w:pPr>
-        <w:rPr>
-          <w:rFonts w:ascii="Times New Roman" w:hAnsi="Times New Roman" w:cs="Times New Roman"/>
-        </w:rPr>
-      </w:pPr>
-      <w:r>
-        <w:rPr>
-          <w:rFonts w:ascii="Times New Roman" w:hAnsi="Times New Roman" w:cs="Times New Roman"/>
-        </w:rPr>
-        <w:t>During development, feedback highlighted that fashion items do not always belong clearly to a single aesthetic. For example, a t-shirt may contain both sporty and streetwear characteristics. However, the style classifier was trained as a single-label model and therefore returns only one primary prediction.</w:t>
-      </w:r>
-    </w:p>
-    <w:p>
-      <w:pPr>
-        <w:rPr>
-          <w:rFonts w:ascii="Times New Roman" w:hAnsi="Times New Roman" w:cs="Times New Roman"/>
-        </w:rPr>
-      </w:pPr>
-      <w:r>
-        <w:rPr>
-          <w:rFonts w:ascii="Times New Roman" w:hAnsi="Times New Roman" w:cs="Times New Roman"/>
-        </w:rPr>
-        <w:t>To make the application more useful in these situations, the backend was extended to use the full style probability distribution instead of only the highest prediction.</w:t>
+        <w:t>Multi-Style Recommendations and Recommendation Mode Selector</w:t>
+      </w:r>
+      <w:bookmarkEnd w:id="12"/>
+    </w:p>
+    <w:p>
+      <w:pPr>
+        <w:rPr>
+          <w:rFonts w:ascii="Times New Roman" w:hAnsi="Times New Roman" w:cs="Times New Roman"/>
+        </w:rPr>
+      </w:pPr>
+      <w:r>
+        <w:rPr>
+          <w:rFonts w:ascii="Times New Roman" w:hAnsi="Times New Roman" w:cs="Times New Roman"/>
+        </w:rPr>
+        <w:t>One of the most important improvements in the final application was the integration of multi-style recommendations.</w:t>
       </w:r>
     </w:p>
     <w:p>
@@ -2756,143 +2779,144 @@
           <w:rFonts w:ascii="Times New Roman" w:hAnsi="Times New Roman" w:cs="Times New Roman"/>
         </w:rPr>
         <w:lastRenderedPageBreak/>
-        <w:t>When the model is confident, the application behaves normally and generates recommendations for a single aesthetic direction. When confidence is lower or another style has a similar probability, the backend generates multiple style candidates.</w:t>
-      </w:r>
-    </w:p>
-    <w:p>
-      <w:pPr>
-        <w:rPr>
-          <w:rFonts w:ascii="Times New Roman" w:hAnsi="Times New Roman" w:cs="Times New Roman"/>
-        </w:rPr>
-      </w:pPr>
-      <w:r>
-        <w:rPr>
-          <w:rFonts w:ascii="Times New Roman" w:hAnsi="Times New Roman" w:cs="Times New Roman"/>
-        </w:rPr>
-        <w:t>For example:</w:t>
-      </w:r>
-    </w:p>
-    <w:p>
-      <w:pPr>
-        <w:numPr>
-          <w:ilvl w:val="0"/>
-          <w:numId w:val="5"/>
-        </w:numPr>
-        <w:rPr>
-          <w:rFonts w:ascii="Times New Roman" w:hAnsi="Times New Roman" w:cs="Times New Roman"/>
-        </w:rPr>
-      </w:pPr>
-      <w:r>
-        <w:rPr>
-          <w:rFonts w:ascii="Times New Roman" w:hAnsi="Times New Roman" w:cs="Times New Roman"/>
-        </w:rPr>
-        <w:t>Streetwear: 57%</w:t>
-      </w:r>
-    </w:p>
-    <w:p>
-      <w:pPr>
-        <w:numPr>
-          <w:ilvl w:val="0"/>
-          <w:numId w:val="5"/>
-        </w:numPr>
-        <w:rPr>
-          <w:rFonts w:ascii="Times New Roman" w:hAnsi="Times New Roman" w:cs="Times New Roman"/>
-        </w:rPr>
-      </w:pPr>
-      <w:r>
-        <w:rPr>
-          <w:rFonts w:ascii="Times New Roman" w:hAnsi="Times New Roman" w:cs="Times New Roman"/>
-        </w:rPr>
-        <w:t>Sporty: 28%</w:t>
-      </w:r>
-    </w:p>
-    <w:p>
-      <w:pPr>
-        <w:numPr>
-          <w:ilvl w:val="0"/>
-          <w:numId w:val="5"/>
-        </w:numPr>
-        <w:rPr>
-          <w:rFonts w:ascii="Times New Roman" w:hAnsi="Times New Roman" w:cs="Times New Roman"/>
-        </w:rPr>
-      </w:pPr>
-      <w:r>
-        <w:rPr>
-          <w:rFonts w:ascii="Times New Roman" w:hAnsi="Times New Roman" w:cs="Times New Roman"/>
-        </w:rPr>
-        <w:t>Formal: 15%</w:t>
-      </w:r>
-    </w:p>
-    <w:p>
-      <w:pPr>
-        <w:numPr>
-          <w:ilvl w:val="0"/>
-          <w:numId w:val="5"/>
-        </w:numPr>
-        <w:rPr>
-          <w:rFonts w:ascii="Times New Roman" w:hAnsi="Times New Roman" w:cs="Times New Roman"/>
-        </w:rPr>
-      </w:pPr>
-      <w:r>
-        <w:rPr>
-          <w:rFonts w:ascii="Times New Roman" w:hAnsi="Times New Roman" w:cs="Times New Roman"/>
-        </w:rPr>
-        <w:t>Gothic: 1%</w:t>
-      </w:r>
-    </w:p>
-    <w:p>
-      <w:pPr>
-        <w:rPr>
-          <w:rFonts w:ascii="Times New Roman" w:hAnsi="Times New Roman" w:cs="Times New Roman"/>
-        </w:rPr>
-      </w:pPr>
-      <w:r>
-        <w:rPr>
-          <w:rFonts w:ascii="Times New Roman" w:hAnsi="Times New Roman" w:cs="Times New Roman"/>
-        </w:rPr>
-        <w:t>Instead of showing only Streetwear recommendations, the application can present both Streetwear and Sporty directions. Each direction contains its own outfit suggestions based on the selected aesthetic.</w:t>
-      </w:r>
-    </w:p>
-    <w:p>
-      <w:pPr>
-        <w:rPr>
-          <w:rFonts w:ascii="Times New Roman" w:hAnsi="Times New Roman" w:cs="Times New Roman"/>
-        </w:rPr>
-      </w:pPr>
-      <w:r>
-        <w:rPr>
-          <w:rFonts w:ascii="Times New Roman" w:hAnsi="Times New Roman" w:cs="Times New Roman"/>
-        </w:rPr>
-        <w:t>This change turns uncertainty into a useful feature rather than hiding it from the user. Instead of forcing a single answer, the application acknowledges that fashion styles can overlap and provides multiple recommendation paths when appropriate.</w:t>
-      </w:r>
-    </w:p>
-    <w:p>
-      <w:pPr>
-        <w:rPr>
-          <w:rFonts w:ascii="Times New Roman" w:hAnsi="Times New Roman" w:cs="Times New Roman"/>
-        </w:rPr>
-      </w:pPr>
-      <w:r>
-        <w:rPr>
-          <w:rFonts w:ascii="Times New Roman" w:hAnsi="Times New Roman" w:cs="Times New Roman"/>
-        </w:rPr>
-        <w:t>The frontend allows users to switch between these aesthetic directions, making the recommendation experience more flexible and interactive.</w:t>
-      </w:r>
-    </w:p>
-    <w:p>
-      <w:pPr>
-        <w:rPr>
-          <w:rFonts w:ascii="Times New Roman" w:hAnsi="Times New Roman" w:cs="Times New Roman"/>
-        </w:rPr>
-      </w:pPr>
-      <w:r>
-        <w:rPr>
-          <w:rFonts w:ascii="Times New Roman" w:hAnsi="Times New Roman" w:cs="Times New Roman"/>
+        <w:t>During development, it became clear that many fashion items do not belong clearly to only one aesthetic. For example, one garment can look both sporty and streetwear. A single-label style classifier forces the system to choose only one result, which can hide useful information when styles overlap.</w:t>
+      </w:r>
+    </w:p>
+    <w:p>
+      <w:pPr>
+        <w:rPr>
+          <w:rFonts w:ascii="Times New Roman" w:hAnsi="Times New Roman" w:cs="Times New Roman"/>
+        </w:rPr>
+      </w:pPr>
+      <w:r>
+        <w:rPr>
+          <w:rFonts w:ascii="Times New Roman" w:hAnsi="Times New Roman" w:cs="Times New Roman"/>
+        </w:rPr>
+        <w:t>To solve this, the final application uses a multi-label MobileNetV3 Large style model. The model predicts separate sigmoid scores for each supported aesthetic: formal, gothic, sporty, and streetwear. A selected threshold is used to decide which styles should become part of the active aesthetic pool. If no style passes the threshold, the system uses the highest scoring style as a fallback.</w:t>
+      </w:r>
+    </w:p>
+    <w:p>
+      <w:pPr>
+        <w:rPr>
+          <w:rFonts w:ascii="Times New Roman" w:hAnsi="Times New Roman" w:cs="Times New Roman"/>
+        </w:rPr>
+      </w:pPr>
+      <w:r>
+        <w:rPr>
+          <w:rFonts w:ascii="Times New Roman" w:hAnsi="Times New Roman" w:cs="Times New Roman"/>
+        </w:rPr>
+        <w:t>For example, an uploaded garment may be interpreted as both:</w:t>
+      </w:r>
+    </w:p>
+    <w:p>
+      <w:pPr>
+        <w:rPr>
+          <w:rFonts w:ascii="Times New Roman" w:hAnsi="Times New Roman" w:cs="Times New Roman"/>
+        </w:rPr>
+      </w:pPr>
+      <w:r>
+        <w:rPr>
+          <w:rFonts w:ascii="Times New Roman" w:hAnsi="Times New Roman" w:cs="Times New Roman"/>
+        </w:rPr>
+        <w:t>• Streetwear</w:t>
+      </w:r>
+      <w:r>
+        <w:rPr>
+          <w:rFonts w:ascii="Times New Roman" w:hAnsi="Times New Roman" w:cs="Times New Roman"/>
+        </w:rPr>
+        <w:br/>
+        <w:t>• Sporty</w:t>
+      </w:r>
+    </w:p>
+    <w:p>
+      <w:pPr>
+        <w:rPr>
+          <w:rFonts w:ascii="Times New Roman" w:hAnsi="Times New Roman" w:cs="Times New Roman"/>
+        </w:rPr>
+      </w:pPr>
+      <w:r>
+        <w:rPr>
+          <w:rFonts w:ascii="Times New Roman" w:hAnsi="Times New Roman" w:cs="Times New Roman"/>
+        </w:rPr>
+        <w:t>Instead of forcing the outfit into only one of these aesthetics, the backend can use both selected styles as a candidate pool. Catalogue items are filtered by the selected aesthetics and then ranked using CLIP visual similarity. This keeps the flexibility of multi-label prediction while avoiding random multi-style recommendations.</w:t>
+      </w:r>
+    </w:p>
+    <w:p>
+      <w:pPr>
+        <w:rPr>
+          <w:rFonts w:ascii="Times New Roman" w:hAnsi="Times New Roman" w:cs="Times New Roman"/>
+        </w:rPr>
+      </w:pPr>
+      <w:r>
+        <w:rPr>
+          <w:rFonts w:ascii="Times New Roman" w:hAnsi="Times New Roman" w:cs="Times New Roman"/>
+        </w:rPr>
+        <w:t>A later improvement added a recommendation mode selector to the frontend. By default, the application uses the combined aesthetic pool, for example Streetwear + Sporty. This is the recommended mode because it reflects the final multi-label + CLIP ranking architecture. However, users can turn combination off and focus the outfit on one specific aesthetic, such as Streetwear only or Sporty only.</w:t>
+      </w:r>
+    </w:p>
+    <w:p>
+      <w:pPr>
+        <w:rPr>
+          <w:rFonts w:ascii="Times New Roman" w:hAnsi="Times New Roman" w:cs="Times New Roman"/>
+        </w:rPr>
+      </w:pPr>
+      <w:r>
+        <w:rPr>
+          <w:rFonts w:ascii="Times New Roman" w:hAnsi="Times New Roman" w:cs="Times New Roman"/>
+        </w:rPr>
+        <w:t xml:space="preserve">When the user changes the recommendation mode, the frontend sends the selected style pool back to the backend. The backend then </w:t>
+      </w:r>
+      <w:proofErr w:type="spellStart"/>
+      <w:r>
+        <w:rPr>
+          <w:rFonts w:ascii="Times New Roman" w:hAnsi="Times New Roman" w:cs="Times New Roman"/>
+        </w:rPr>
+        <w:t>reranks</w:t>
+      </w:r>
+      <w:proofErr w:type="spellEnd"/>
+      <w:r>
+        <w:rPr>
+          <w:rFonts w:ascii="Times New Roman" w:hAnsi="Times New Roman" w:cs="Times New Roman"/>
+        </w:rPr>
+        <w:t xml:space="preserve"> the catalogue items with CLIP using the chosen style pool. This means the interface does not simply hide or filter existing results on the frontend. It asks the recommendation system to generate a new outfit based on the selected mode.</w:t>
+      </w:r>
+    </w:p>
+    <w:p>
+      <w:pPr>
+        <w:rPr>
+          <w:rFonts w:ascii="Times New Roman" w:hAnsi="Times New Roman" w:cs="Times New Roman"/>
+        </w:rPr>
+      </w:pPr>
+      <w:r>
+        <w:rPr>
+          <w:rFonts w:ascii="Times New Roman" w:hAnsi="Times New Roman" w:cs="Times New Roman"/>
+        </w:rPr>
+        <w:t>The interface also updates the garment profile based on the active style pool. If the user selects a single aesthetic, the displayed style label and style confidence adjust to that choice. If the user returns to combined mode, the profile shows the combined aesthetic label and a style pool confidence summary.</w:t>
+      </w:r>
+    </w:p>
+    <w:p>
+      <w:pPr>
+        <w:rPr>
+          <w:rFonts w:ascii="Times New Roman" w:hAnsi="Times New Roman" w:cs="Times New Roman"/>
+        </w:rPr>
+      </w:pPr>
+      <w:r>
+        <w:rPr>
+          <w:rFonts w:ascii="Times New Roman" w:hAnsi="Times New Roman" w:cs="Times New Roman"/>
+          <w:noProof/>
         </w:rPr>
         <w:drawing>
-          <wp:inline distT="0" distB="0" distL="0" distR="0" wp14:anchorId="4D5F98B5" wp14:editId="5D6B4F7A">
-            <wp:extent cx="6858000" cy="3329305"/>
-            <wp:effectExtent l="0" t="0" r="0" b="4445"/>
+          <wp:anchor distT="0" distB="0" distL="114300" distR="114300" simplePos="0" relativeHeight="251663360" behindDoc="0" locked="0" layoutInCell="1" allowOverlap="1" wp14:anchorId="4D5F98B5" wp14:editId="4CE5E631">
+            <wp:simplePos x="0" y="0"/>
+            <wp:positionH relativeFrom="column">
+              <wp:posOffset>1249680</wp:posOffset>
+            </wp:positionH>
+            <wp:positionV relativeFrom="paragraph">
+              <wp:posOffset>688340</wp:posOffset>
+            </wp:positionV>
+            <wp:extent cx="4099560" cy="1990090"/>
+            <wp:effectExtent l="0" t="0" r="0" b="0"/>
+            <wp:wrapTopAndBottom/>
             <wp:docPr id="538656718" name="Picture 1"/>
             <wp:cNvGraphicFramePr>
               <a:graphicFrameLocks xmlns:a="http://schemas.openxmlformats.org/drawingml/2006/main" noChangeAspect="1"/>
@@ -2905,7 +2929,13 @@
                     <pic:cNvPicPr/>
                   </pic:nvPicPr>
                   <pic:blipFill>
-                    <a:blip r:embed="rId16"/>
+                    <a:blip r:embed="rId16" cstate="print">
+                      <a:extLst>
+                        <a:ext uri="{28A0092B-C50C-407E-A947-70E740481C1C}">
+                          <a14:useLocalDpi xmlns:a14="http://schemas.microsoft.com/office/drawing/2010/main" val="0"/>
+                        </a:ext>
+                      </a:extLst>
+                    </a:blip>
                     <a:stretch>
                       <a:fillRect/>
                     </a:stretch>
@@ -2913,7 +2943,7 @@
                   <pic:spPr>
                     <a:xfrm>
                       <a:off x="0" y="0"/>
-                      <a:ext cx="6858000" cy="3329305"/>
+                      <a:ext cx="4099560" cy="1990090"/>
                     </a:xfrm>
                     <a:prstGeom prst="rect">
                       <a:avLst/>
@@ -2922,8 +2952,14 @@
                 </pic:pic>
               </a:graphicData>
             </a:graphic>
-          </wp:inline>
+          </wp:anchor>
         </w:drawing>
+      </w:r>
+      <w:r>
+        <w:rPr>
+          <w:rFonts w:ascii="Times New Roman" w:hAnsi="Times New Roman" w:cs="Times New Roman"/>
+        </w:rPr>
+        <w:t>This feature improves both recommendation quality and user control. The system can still use overlapping aesthetics when they are useful, but the user can also restrict the output to one focused aesthetic when they prefer a more consistent style direction.</w:t>
       </w:r>
     </w:p>
     <w:p>
@@ -2936,16 +2972,19 @@
           <w:bCs/>
         </w:rPr>
       </w:pPr>
-      <w:bookmarkStart w:id="7" w:name="_Toc231749850"/>
+      <w:bookmarkStart w:id="13" w:name="_Toc231749850"/>
+      <w:bookmarkStart w:id="14" w:name="_Toc232515579"/>
       <w:r>
         <w:rPr>
           <w:rFonts w:ascii="Times New Roman" w:hAnsi="Times New Roman" w:cs="Times New Roman"/>
           <w:b/>
           <w:bCs/>
         </w:rPr>
+        <w:lastRenderedPageBreak/>
         <w:t>Item Replacement</w:t>
       </w:r>
-      <w:bookmarkEnd w:id="7"/>
+      <w:bookmarkEnd w:id="13"/>
+      <w:bookmarkEnd w:id="14"/>
     </w:p>
     <w:p>
       <w:pPr>
@@ -2983,8 +3022,7 @@
         <w:rPr>
           <w:rFonts w:ascii="Times New Roman" w:hAnsi="Times New Roman" w:cs="Times New Roman"/>
         </w:rPr>
-        <w:lastRenderedPageBreak/>
-        <w:t>To solve this, the application allows individual items within an outfit to be refreshed. When a user requests a replacement, the frontend sends the selected clothing category together with information about the current recommendation set.</w:t>
+        <w:t>To solve this, the application allows individual items within an outfit to be refreshed. When a user requests a replacement, the frontend sends the selected clothing category, the currently visible outfit items, and the active style pool.</w:t>
       </w:r>
     </w:p>
     <w:p>
@@ -3004,7 +3042,7 @@
       <w:pPr>
         <w:numPr>
           <w:ilvl w:val="0"/>
-          <w:numId w:val="6"/>
+          <w:numId w:val="10"/>
         </w:numPr>
         <w:rPr>
           <w:rFonts w:ascii="Times New Roman" w:hAnsi="Times New Roman" w:cs="Times New Roman"/>
@@ -3014,14 +3052,14 @@
         <w:rPr>
           <w:rFonts w:ascii="Times New Roman" w:hAnsi="Times New Roman" w:cs="Times New Roman"/>
         </w:rPr>
-        <w:t>Filters catalogue items that match the current aesthetic direction.</w:t>
+        <w:t>Filters catalogue items that match the current active style pool.</w:t>
       </w:r>
     </w:p>
     <w:p>
       <w:pPr>
         <w:numPr>
           <w:ilvl w:val="0"/>
-          <w:numId w:val="6"/>
+          <w:numId w:val="10"/>
         </w:numPr>
         <w:rPr>
           <w:rFonts w:ascii="Times New Roman" w:hAnsi="Times New Roman" w:cs="Times New Roman"/>
@@ -3038,7 +3076,7 @@
       <w:pPr>
         <w:numPr>
           <w:ilvl w:val="0"/>
-          <w:numId w:val="6"/>
+          <w:numId w:val="10"/>
         </w:numPr>
         <w:rPr>
           <w:rFonts w:ascii="Times New Roman" w:hAnsi="Times New Roman" w:cs="Times New Roman"/>
@@ -3055,7 +3093,7 @@
       <w:pPr>
         <w:numPr>
           <w:ilvl w:val="0"/>
-          <w:numId w:val="6"/>
+          <w:numId w:val="10"/>
         </w:numPr>
         <w:rPr>
           <w:rFonts w:ascii="Times New Roman" w:hAnsi="Times New Roman" w:cs="Times New Roman"/>
@@ -3072,7 +3110,7 @@
       <w:pPr>
         <w:numPr>
           <w:ilvl w:val="0"/>
-          <w:numId w:val="6"/>
+          <w:numId w:val="10"/>
         </w:numPr>
         <w:rPr>
           <w:rFonts w:ascii="Times New Roman" w:hAnsi="Times New Roman" w:cs="Times New Roman"/>
@@ -3095,20 +3133,33 @@
         <w:rPr>
           <w:rFonts w:ascii="Times New Roman" w:hAnsi="Times New Roman" w:cs="Times New Roman"/>
         </w:rPr>
-        <w:t>This allows users to explore different outfit combinations while maintaining the same overall aesthetic. For example, a user can keep the recommended shoes and trousers but request a different jacket that better matches their personal preference.</w:t>
-      </w:r>
-    </w:p>
-    <w:p>
-      <w:pPr>
-        <w:rPr>
-          <w:rFonts w:ascii="Times New Roman" w:hAnsi="Times New Roman" w:cs="Times New Roman"/>
-        </w:rPr>
-      </w:pPr>
-      <w:r>
-        <w:rPr>
-          <w:rFonts w:ascii="Times New Roman" w:hAnsi="Times New Roman" w:cs="Times New Roman"/>
-        </w:rPr>
-        <w:t>The feature improves user control and makes the application feel more dynamic. Rather than presenting recommendations as fixed outputs, it allows users to actively explore variations within the selected style direction.</w:t>
+        <w:t>This means the replacement feature stays consistent with the recommendation mode selected by the user. For example, if the user selects Sporty only, refreshed items will also come from sporty catalogue items. If the user uses the combined Streetwear + Sporty mode, replacements can come from either of those selected aesthetics.</w:t>
+      </w:r>
+    </w:p>
+    <w:p>
+      <w:pPr>
+        <w:rPr>
+          <w:rFonts w:ascii="Times New Roman" w:hAnsi="Times New Roman" w:cs="Times New Roman"/>
+        </w:rPr>
+      </w:pPr>
+      <w:r>
+        <w:rPr>
+          <w:rFonts w:ascii="Times New Roman" w:hAnsi="Times New Roman" w:cs="Times New Roman"/>
+        </w:rPr>
+        <w:t>This makes the item replacement feature more coherent. The user can explore alternative outfit pieces without accidentally leaving the selected recommendation direction.</w:t>
+      </w:r>
+    </w:p>
+    <w:p>
+      <w:pPr>
+        <w:rPr>
+          <w:rFonts w:ascii="Times New Roman" w:hAnsi="Times New Roman" w:cs="Times New Roman"/>
+        </w:rPr>
+      </w:pPr>
+      <w:r>
+        <w:rPr>
+          <w:rFonts w:ascii="Times New Roman" w:hAnsi="Times New Roman" w:cs="Times New Roman"/>
+        </w:rPr>
+        <w:t>The feature improves user control and makes the application feel more dynamic. Rather than presenting recommendations as fixed outputs, it allows users to actively explore variations within the selected style pool.</w:t>
       </w:r>
     </w:p>
     <w:p>
@@ -3121,7 +3172,8 @@
           <w:bCs/>
         </w:rPr>
       </w:pPr>
-      <w:bookmarkStart w:id="8" w:name="_Toc231749851"/>
+      <w:bookmarkStart w:id="15" w:name="_Toc231749851"/>
+      <w:bookmarkStart w:id="16" w:name="_Toc232515580"/>
       <w:r>
         <w:rPr>
           <w:rFonts w:ascii="Times New Roman" w:hAnsi="Times New Roman" w:cs="Times New Roman"/>
@@ -3130,7 +3182,8 @@
         </w:rPr>
         <w:t>User Interface and User Experience Improvements ( UI/UX )</w:t>
       </w:r>
-      <w:bookmarkEnd w:id="8"/>
+      <w:bookmarkEnd w:id="15"/>
+      <w:bookmarkEnd w:id="16"/>
     </w:p>
     <w:p>
       <w:pPr>
@@ -3181,20 +3234,53 @@
         <w:rPr>
           <w:rFonts w:ascii="Times New Roman" w:hAnsi="Times New Roman" w:cs="Times New Roman"/>
         </w:rPr>
-        <w:t>The Analysis section was redesigned to present the prediction results in a more user-friendly way. Instead of displaying technical information directly, the application summarizes the result as a garment profile. This provides users with a simple explanation of how the system interpreted the uploaded item.</w:t>
-      </w:r>
-    </w:p>
-    <w:p>
-      <w:pPr>
-        <w:rPr>
-          <w:rFonts w:ascii="Times New Roman" w:hAnsi="Times New Roman" w:cs="Times New Roman"/>
-        </w:rPr>
-      </w:pPr>
-      <w:r>
-        <w:rPr>
-          <w:rFonts w:ascii="Times New Roman" w:hAnsi="Times New Roman" w:cs="Times New Roman"/>
-        </w:rPr>
-        <w:t>The aesthetic direction selector was also integrated into the Analysis section. This allows users to switch between different recommendation directions when multiple styles are available, creating a more natural flow between analysis and recommendations.</w:t>
+        <w:t>The Analysis section was redesigned to present the prediction results in a more user-friendly way. Instead of displaying only technical information, the application summarizes the result as a garment profile. This gives users a clear explanation of how the system interpreted the uploaded item.</w:t>
+      </w:r>
+    </w:p>
+    <w:p>
+      <w:pPr>
+        <w:rPr>
+          <w:rFonts w:ascii="Times New Roman" w:hAnsi="Times New Roman" w:cs="Times New Roman"/>
+        </w:rPr>
+      </w:pPr>
+      <w:r>
+        <w:rPr>
+          <w:rFonts w:ascii="Times New Roman" w:hAnsi="Times New Roman" w:cs="Times New Roman"/>
+        </w:rPr>
+        <w:t xml:space="preserve">The final UI also includes a recommendation mode selector. When multiple aesthetics are detected, the user can keep the default combined mode or turn combination off to focus the outfit on one aesthetic. In combined mode, </w:t>
+      </w:r>
+      <w:r>
+        <w:rPr>
+          <w:rFonts w:ascii="Times New Roman" w:hAnsi="Times New Roman" w:cs="Times New Roman"/>
+        </w:rPr>
+        <w:lastRenderedPageBreak/>
+        <w:t>the system uses the full detected style pool, for example Streetwear + Sporty. In focused mode, the user can choose one specific aesthetic, such as Streetwear only or Sporty only.</w:t>
+      </w:r>
+    </w:p>
+    <w:p>
+      <w:pPr>
+        <w:rPr>
+          <w:rFonts w:ascii="Times New Roman" w:hAnsi="Times New Roman" w:cs="Times New Roman"/>
+        </w:rPr>
+      </w:pPr>
+      <w:r>
+        <w:rPr>
+          <w:rFonts w:ascii="Times New Roman" w:hAnsi="Times New Roman" w:cs="Times New Roman"/>
+        </w:rPr>
+        <w:t>This selector was originally shown as several large option cards, but it was later simplified into a cleaner toggle-based interaction. The toggle controls whether the detected styles are combined. When combination is turned off, the interface displays the individual style options. This reduced visual clutter and made the interaction easier to understand.</w:t>
+      </w:r>
+    </w:p>
+    <w:p>
+      <w:pPr>
+        <w:rPr>
+          <w:rFonts w:ascii="Times New Roman" w:hAnsi="Times New Roman" w:cs="Times New Roman"/>
+        </w:rPr>
+      </w:pPr>
+      <w:r>
+        <w:rPr>
+          <w:rFonts w:ascii="Times New Roman" w:hAnsi="Times New Roman" w:cs="Times New Roman"/>
+        </w:rPr>
+        <w:t>The top garment profile also updates based on the selected recommendation mode. For example, if the user selects Sporty only, the profile reflects the sporty style label and confidence score. If the user returns to combined mode, the interface shows the combined aesthetic label and a style pool confidence summary.</w:t>
       </w:r>
     </w:p>
     <w:p>
@@ -3220,22 +3306,49 @@
         <w:rPr>
           <w:rFonts w:ascii="Times New Roman" w:hAnsi="Times New Roman" w:cs="Times New Roman"/>
         </w:rPr>
-        <w:t>The layout was continuously refined to reduce scrolling, improve readability, and create a clearer visual hierarchy. Large section headers, simplified descriptions, and a more structured presentation of confidence information were introduced to make the application easier to navigate.</w:t>
-      </w:r>
-    </w:p>
-    <w:p>
-      <w:pPr>
-        <w:rPr>
-          <w:rFonts w:ascii="Times New Roman" w:hAnsi="Times New Roman" w:cs="Times New Roman"/>
-        </w:rPr>
-      </w:pPr>
-      <w:r>
-        <w:rPr>
-          <w:rFonts w:ascii="Times New Roman" w:hAnsi="Times New Roman" w:cs="Times New Roman"/>
-        </w:rPr>
-        <w:lastRenderedPageBreak/>
+        <w:t>The layout was continuously refined to reduce scrolling, improve readability, and create a clearer visual hierarchy. Large section headers, simplified descriptions, compact controls, and a more structured presentation of confidence information were introduced to make the application easier to navigate.</w:t>
+      </w:r>
+    </w:p>
+    <w:p>
+      <w:pPr>
+        <w:rPr>
+          <w:rFonts w:ascii="Times New Roman" w:hAnsi="Times New Roman" w:cs="Times New Roman"/>
+        </w:rPr>
+      </w:pPr>
+      <w:r>
+        <w:rPr>
+          <w:rFonts w:ascii="Times New Roman" w:hAnsi="Times New Roman" w:cs="Times New Roman"/>
+        </w:rPr>
+        <w:t xml:space="preserve">Although the visual design was partly AI-assisted, the frontend </w:t>
+      </w:r>
+      <w:proofErr w:type="spellStart"/>
+      <w:r>
+        <w:rPr>
+          <w:rFonts w:ascii="Times New Roman" w:hAnsi="Times New Roman" w:cs="Times New Roman"/>
+        </w:rPr>
+        <w:t>behaviour</w:t>
+      </w:r>
+      <w:proofErr w:type="spellEnd"/>
+      <w:r>
+        <w:rPr>
+          <w:rFonts w:ascii="Times New Roman" w:hAnsi="Times New Roman" w:cs="Times New Roman"/>
+        </w:rPr>
+        <w:t>, backend integration, recommendation workflows, state management, and user interactions were implemented as part of the project. This ensured that the interface was visually polished and properly connected to the recommendation system and its underlying logic.</w:t>
+      </w:r>
+    </w:p>
+    <w:p>
+      <w:pPr>
+        <w:rPr>
+          <w:rFonts w:ascii="Times New Roman" w:hAnsi="Times New Roman" w:cs="Times New Roman"/>
+        </w:rPr>
+      </w:pPr>
+      <w:r>
+        <w:rPr>
+          <w:rFonts w:ascii="Times New Roman" w:hAnsi="Times New Roman" w:cs="Times New Roman"/>
+          <w:noProof/>
+        </w:rPr>
         <w:drawing>
-          <wp:inline distT="0" distB="0" distL="0" distR="0" wp14:anchorId="6D60DFE4" wp14:editId="7443E495">
+          <wp:inline distT="0" distB="0" distL="0" distR="0" wp14:anchorId="6D60DFE4" wp14:editId="66220857">
             <wp:extent cx="6858000" cy="2842260"/>
             <wp:effectExtent l="0" t="0" r="0" b="0"/>
             <wp:docPr id="602738017" name="Picture 1"/>
@@ -3280,9 +3393,11 @@
       <w:r>
         <w:rPr>
           <w:rFonts w:ascii="Times New Roman" w:hAnsi="Times New Roman" w:cs="Times New Roman"/>
-        </w:rPr>
+          <w:noProof/>
+        </w:rPr>
+        <w:lastRenderedPageBreak/>
         <w:drawing>
-          <wp:inline distT="0" distB="0" distL="0" distR="0" wp14:anchorId="34AA5021" wp14:editId="1D6C12FE">
+          <wp:inline distT="0" distB="0" distL="0" distR="0" wp14:anchorId="34AA5021" wp14:editId="748CF996">
             <wp:extent cx="6858000" cy="2080895"/>
             <wp:effectExtent l="0" t="0" r="0" b="0"/>
             <wp:docPr id="360079683" name="Picture 1"/>
@@ -3320,33 +3435,6 @@
     </w:p>
     <w:p>
       <w:pPr>
-        <w:rPr>
-          <w:rFonts w:ascii="Times New Roman" w:hAnsi="Times New Roman" w:cs="Times New Roman"/>
-        </w:rPr>
-      </w:pPr>
-      <w:r>
-        <w:rPr>
-          <w:rFonts w:ascii="Times New Roman" w:hAnsi="Times New Roman" w:cs="Times New Roman"/>
-        </w:rPr>
-        <w:t xml:space="preserve">Although the visual design was largely AI-assisted, the frontend </w:t>
-      </w:r>
-      <w:proofErr w:type="spellStart"/>
-      <w:r>
-        <w:rPr>
-          <w:rFonts w:ascii="Times New Roman" w:hAnsi="Times New Roman" w:cs="Times New Roman"/>
-        </w:rPr>
-        <w:t>behaviour</w:t>
-      </w:r>
-      <w:proofErr w:type="spellEnd"/>
-      <w:r>
-        <w:rPr>
-          <w:rFonts w:ascii="Times New Roman" w:hAnsi="Times New Roman" w:cs="Times New Roman"/>
-        </w:rPr>
-        <w:t>, backend integration, recommendation workflows, state management, and user interactions were implemented as part of the project. This ensured that the interface was not only visually appealing but also properly connected to the recommendation system and its underlying logic.</w:t>
-      </w:r>
-    </w:p>
-    <w:p>
-      <w:pPr>
         <w:pStyle w:val="Heading1"/>
         <w:jc w:val="center"/>
         <w:rPr>
@@ -3355,7 +3443,8 @@
           <w:bCs/>
         </w:rPr>
       </w:pPr>
-      <w:bookmarkStart w:id="9" w:name="_Toc231749852"/>
+      <w:bookmarkStart w:id="17" w:name="_Toc231749852"/>
+      <w:bookmarkStart w:id="18" w:name="_Toc232515581"/>
       <w:r>
         <w:rPr>
           <w:rFonts w:ascii="Times New Roman" w:hAnsi="Times New Roman" w:cs="Times New Roman"/>
@@ -3364,7 +3453,8 @@
         </w:rPr>
         <w:t>Technical Implementation and Deployment</w:t>
       </w:r>
-      <w:bookmarkEnd w:id="9"/>
+      <w:bookmarkEnd w:id="17"/>
+      <w:bookmarkEnd w:id="18"/>
     </w:p>
     <w:p>
       <w:pPr>
@@ -3403,7 +3493,7 @@
         <w:rPr>
           <w:rFonts w:ascii="Times New Roman" w:hAnsi="Times New Roman" w:cs="Times New Roman"/>
         </w:rPr>
-        <w:t>The backend is responsible for handling image uploads, running the machine learning models, validating predictions, generating recommendations, and returning the results to the frontend. To improve performance, the trained models and catalogue embeddings are loaded once and reused across requests instead of being reloaded every time.</w:t>
+        <w:t>The backend is responsible for handling image uploads, validating input, running the machine learning models, generating recommendations, reranking catalogue items, and returning results to the frontend. To improve performance, the trained models and catalogue embeddings are loaded once and reused across requests instead of being reloaded every time.</w:t>
       </w:r>
     </w:p>
     <w:p>
@@ -3421,44 +3511,98 @@
     </w:p>
     <w:p>
       <w:pPr>
-        <w:numPr>
-          <w:ilvl w:val="0"/>
-          <w:numId w:val="7"/>
-        </w:numPr>
-        <w:rPr>
-          <w:rFonts w:ascii="Times New Roman" w:hAnsi="Times New Roman" w:cs="Times New Roman"/>
-        </w:rPr>
-      </w:pPr>
-      <w:r>
-        <w:rPr>
-          <w:rFonts w:ascii="Times New Roman" w:hAnsi="Times New Roman" w:cs="Times New Roman"/>
-        </w:rPr>
-        <w:t>MobileNetV3 Large for style classification</w:t>
-      </w:r>
-    </w:p>
-    <w:p>
-      <w:pPr>
-        <w:numPr>
-          <w:ilvl w:val="0"/>
-          <w:numId w:val="7"/>
-        </w:numPr>
-        <w:rPr>
-          <w:rFonts w:ascii="Times New Roman" w:hAnsi="Times New Roman" w:cs="Times New Roman"/>
-        </w:rPr>
-      </w:pPr>
-      <w:r>
-        <w:rPr>
-          <w:rFonts w:ascii="Times New Roman" w:hAnsi="Times New Roman" w:cs="Times New Roman"/>
-        </w:rPr>
-        <w:t>Improved ResNet34 for clothing type classification</w:t>
-      </w:r>
-    </w:p>
-    <w:p>
-      <w:pPr>
-        <w:numPr>
-          <w:ilvl w:val="0"/>
-          <w:numId w:val="7"/>
-        </w:numPr>
+        <w:rPr>
+          <w:rFonts w:ascii="Times New Roman" w:hAnsi="Times New Roman" w:cs="Times New Roman"/>
+        </w:rPr>
+      </w:pPr>
+      <w:r>
+        <w:rPr>
+          <w:rFonts w:ascii="Times New Roman" w:hAnsi="Times New Roman" w:cs="Times New Roman"/>
+        </w:rPr>
+        <w:t>• Multi-label MobileNetV3 Large for style classification</w:t>
+      </w:r>
+      <w:r>
+        <w:rPr>
+          <w:rFonts w:ascii="Times New Roman" w:hAnsi="Times New Roman" w:cs="Times New Roman"/>
+        </w:rPr>
+        <w:br/>
+        <w:t>• Improved ResNet34 for clothing type classification</w:t>
+      </w:r>
+      <w:r>
+        <w:rPr>
+          <w:rFonts w:ascii="Times New Roman" w:hAnsi="Times New Roman" w:cs="Times New Roman"/>
+        </w:rPr>
+        <w:br/>
+        <w:t>• CLIP embeddings for recommendation ranking</w:t>
+      </w:r>
+    </w:p>
+    <w:p>
+      <w:pPr>
+        <w:rPr>
+          <w:rFonts w:ascii="Times New Roman" w:hAnsi="Times New Roman" w:cs="Times New Roman"/>
+        </w:rPr>
+      </w:pPr>
+      <w:r>
+        <w:rPr>
+          <w:rFonts w:ascii="Times New Roman" w:hAnsi="Times New Roman" w:cs="Times New Roman"/>
+        </w:rPr>
+        <w:t>The backend exposes the main recommendation endpoint, which analyses the uploaded image and returns the initial outfit suggestions. This endpoint performs validation, style prediction, clothing type prediction, CLIP embedding generation, catalogue filtering, and recommendation ranking.</w:t>
+      </w:r>
+    </w:p>
+    <w:p>
+      <w:pPr>
+        <w:rPr>
+          <w:rFonts w:ascii="Times New Roman" w:hAnsi="Times New Roman" w:cs="Times New Roman"/>
+        </w:rPr>
+      </w:pPr>
+      <w:r>
+        <w:rPr>
+          <w:rFonts w:ascii="Times New Roman" w:hAnsi="Times New Roman" w:cs="Times New Roman"/>
+        </w:rPr>
+        <w:t>A second endpoint was added for refining recommendations based on the selected style pool. This endpoint allows the frontend to send a custom style selection, such as Sporty only or Streetwear + Sporty, and receive a newly ranked outfit without rerunning the full style classification step.</w:t>
+      </w:r>
+    </w:p>
+    <w:p>
+      <w:pPr>
+        <w:rPr>
+          <w:rFonts w:ascii="Times New Roman" w:hAnsi="Times New Roman" w:cs="Times New Roman"/>
+        </w:rPr>
+      </w:pPr>
+      <w:r>
+        <w:rPr>
+          <w:rFonts w:ascii="Times New Roman" w:hAnsi="Times New Roman" w:cs="Times New Roman"/>
+        </w:rPr>
+        <w:t>This design keeps the user interaction responsive while preserving recommendation quality. The frontend controls the selected recommendation mode, but the backend still performs the actual catalogue filtering and CLIP-based ranking. This avoids shallow client-side filtering and ensures that each mode produces a properly ranked outfit.</w:t>
+      </w:r>
+    </w:p>
+    <w:p>
+      <w:pPr>
+        <w:rPr>
+          <w:rFonts w:ascii="Times New Roman" w:hAnsi="Times New Roman" w:cs="Times New Roman"/>
+        </w:rPr>
+      </w:pPr>
+      <w:r>
+        <w:rPr>
+          <w:rFonts w:ascii="Times New Roman" w:hAnsi="Times New Roman" w:cs="Times New Roman"/>
+        </w:rPr>
+        <w:t>The item replacement feature also uses the active style pool. When a user refreshes an item, the frontend sends the currently selected recommendation mode to the backend. The backend then finds an alternative item from the correct style pool and ranks it using CLIP similarity.</w:t>
+      </w:r>
+    </w:p>
+    <w:p>
+      <w:pPr>
+        <w:rPr>
+          <w:rFonts w:ascii="Times New Roman" w:hAnsi="Times New Roman" w:cs="Times New Roman"/>
+        </w:rPr>
+      </w:pPr>
+      <w:r>
+        <w:rPr>
+          <w:rFonts w:ascii="Times New Roman" w:hAnsi="Times New Roman" w:cs="Times New Roman"/>
+        </w:rPr>
+        <w:t>The trained model files are stored directly inside the backend and are loaded locally when the application starts. This means the backend hosts both the API and the machine learning models, creating a self-contained deployment.</w:t>
+      </w:r>
+    </w:p>
+    <w:p>
+      <w:pPr>
         <w:rPr>
           <w:rFonts w:ascii="Times New Roman" w:hAnsi="Times New Roman" w:cs="Times New Roman"/>
         </w:rPr>
@@ -3468,32 +3612,6 @@
           <w:rFonts w:ascii="Times New Roman" w:hAnsi="Times New Roman" w:cs="Times New Roman"/>
         </w:rPr>
         <w:lastRenderedPageBreak/>
-        <w:t>CLIP embeddings for recommendation ranking</w:t>
-      </w:r>
-    </w:p>
-    <w:p>
-      <w:pPr>
-        <w:rPr>
-          <w:rFonts w:ascii="Times New Roman" w:hAnsi="Times New Roman" w:cs="Times New Roman"/>
-        </w:rPr>
-      </w:pPr>
-      <w:r>
-        <w:rPr>
-          <w:rFonts w:ascii="Times New Roman" w:hAnsi="Times New Roman" w:cs="Times New Roman"/>
-        </w:rPr>
-        <w:t>The trained model files are stored directly inside the backend and are loaded locally when the application starts. This means the backend hosts both the API and the machine learning models, creating a self-contained deployment.</w:t>
-      </w:r>
-    </w:p>
-    <w:p>
-      <w:pPr>
-        <w:rPr>
-          <w:rFonts w:ascii="Times New Roman" w:hAnsi="Times New Roman" w:cs="Times New Roman"/>
-        </w:rPr>
-      </w:pPr>
-      <w:r>
-        <w:rPr>
-          <w:rFonts w:ascii="Times New Roman" w:hAnsi="Times New Roman" w:cs="Times New Roman"/>
-        </w:rPr>
         <w:t>To improve recommendation speed, catalogue embeddings are generated beforehand and stored in a dedicated file. During recommendation generation, the system only needs to compare the uploaded image embedding against the precomputed catalogue embeddings instead of processing the entire catalogue from scratch.</w:t>
       </w:r>
     </w:p>
@@ -3547,7 +3665,7 @@
         <w:rPr>
           <w:rFonts w:ascii="Times New Roman" w:hAnsi="Times New Roman" w:cs="Times New Roman"/>
         </w:rPr>
-        <w:t>This architecture was chosen because it keeps the deployment process simple while still supporting all required functionality of the recommendation system.</w:t>
+        <w:t>This architecture was chosen because it keeps the deployment process simple while still supporting the full recommendation workflow, including validation, multi-label analysis, CLIP-ranked outfit generation, recommendation mode switching, and item replacement.</w:t>
       </w:r>
     </w:p>
     <w:p>
@@ -3560,7 +3678,8 @@
           <w:bCs/>
         </w:rPr>
       </w:pPr>
-      <w:bookmarkStart w:id="10" w:name="_Toc231749853"/>
+      <w:bookmarkStart w:id="19" w:name="_Toc231749853"/>
+      <w:bookmarkStart w:id="20" w:name="_Toc232515582"/>
       <w:r>
         <w:rPr>
           <w:rFonts w:ascii="Times New Roman" w:hAnsi="Times New Roman" w:cs="Times New Roman"/>
@@ -3569,7 +3688,8 @@
         </w:rPr>
         <w:t>Reflection and Future Improvements</w:t>
       </w:r>
-      <w:bookmarkEnd w:id="10"/>
+      <w:bookmarkEnd w:id="19"/>
+      <w:bookmarkEnd w:id="20"/>
     </w:p>
     <w:p>
       <w:pPr>
@@ -3594,20 +3714,47 @@
         <w:rPr>
           <w:rFonts w:ascii="Times New Roman" w:hAnsi="Times New Roman" w:cs="Times New Roman"/>
         </w:rPr>
-        <w:t>One important lesson was that uncertainty should not always be hidden. The introduction of reliability levels and multi-style recommendations transformed uncertain predictions into useful information for users. Instead of forcing a single answer, the application now provides alternative aesthetic directions when appropriate.</w:t>
-      </w:r>
-    </w:p>
-    <w:p>
-      <w:pPr>
-        <w:rPr>
-          <w:rFonts w:ascii="Times New Roman" w:hAnsi="Times New Roman" w:cs="Times New Roman"/>
-        </w:rPr>
-      </w:pPr>
-      <w:r>
-        <w:rPr>
-          <w:rFonts w:ascii="Times New Roman" w:hAnsi="Times New Roman" w:cs="Times New Roman"/>
-        </w:rPr>
-        <w:t>Another lesson was that recommendation quality depends on the entire pipeline rather than a single model. Improvements to style prediction, clothing type prediction, recommendation ranking, validation logic, and user interface design all contributed to the final user experience.</w:t>
+        <w:t>One important lesson was that uncertainty should not always be hidden. The introduction of reliability levels, multi-label style prediction, and the recommendation mode selector transformed uncertain or overlapping style predictions into useful user controls. Instead of forcing a single aesthetic, the application can now use a combined style pool or allow the user to focus on one selected aesthetic.</w:t>
+      </w:r>
+    </w:p>
+    <w:p>
+      <w:pPr>
+        <w:rPr>
+          <w:rFonts w:ascii="Times New Roman" w:hAnsi="Times New Roman" w:cs="Times New Roman"/>
+        </w:rPr>
+      </w:pPr>
+      <w:r>
+        <w:rPr>
+          <w:rFonts w:ascii="Times New Roman" w:hAnsi="Times New Roman" w:cs="Times New Roman"/>
+        </w:rPr>
+        <w:t>Another lesson was that recommendation quality depends on the entire pipeline rather than a single model. Improvements to style prediction, clothing type prediction, recommendation ranking, validation logic, user interface design, and frontend state management all contributed to the final user experience.</w:t>
+      </w:r>
+    </w:p>
+    <w:p>
+      <w:pPr>
+        <w:rPr>
+          <w:rFonts w:ascii="Times New Roman" w:hAnsi="Times New Roman" w:cs="Times New Roman"/>
+        </w:rPr>
+      </w:pPr>
+      <w:r>
+        <w:rPr>
+          <w:rFonts w:ascii="Times New Roman" w:hAnsi="Times New Roman" w:cs="Times New Roman"/>
+        </w:rPr>
+        <w:t xml:space="preserve">The style selector also showed the importance of matching the user interface to the actual backend logic. A simple frontend filter would have been easier to implement, but it would not have produced genuinely reranked recommendations. The final solution sends the selected style pool back to the backend so CLIP can </w:t>
+      </w:r>
+      <w:proofErr w:type="spellStart"/>
+      <w:r>
+        <w:rPr>
+          <w:rFonts w:ascii="Times New Roman" w:hAnsi="Times New Roman" w:cs="Times New Roman"/>
+        </w:rPr>
+        <w:t>rerank</w:t>
+      </w:r>
+      <w:proofErr w:type="spellEnd"/>
+      <w:r>
+        <w:rPr>
+          <w:rFonts w:ascii="Times New Roman" w:hAnsi="Times New Roman" w:cs="Times New Roman"/>
+        </w:rPr>
+        <w:t xml:space="preserve"> the catalogue items properly for the selected mode.</w:t>
       </w:r>
     </w:p>
     <w:p>
@@ -3652,36 +3799,22 @@
     </w:p>
     <w:p>
       <w:pPr>
-        <w:numPr>
-          <w:ilvl w:val="0"/>
-          <w:numId w:val="8"/>
-        </w:numPr>
-        <w:rPr>
-          <w:rFonts w:ascii="Times New Roman" w:hAnsi="Times New Roman" w:cs="Times New Roman"/>
-        </w:rPr>
-      </w:pPr>
-      <w:r>
-        <w:rPr>
-          <w:rFonts w:ascii="Times New Roman" w:hAnsi="Times New Roman" w:cs="Times New Roman"/>
-        </w:rPr>
-        <w:t>Expanding the recommendation catalogue with more clothing items.</w:t>
-      </w:r>
-    </w:p>
-    <w:p>
-      <w:pPr>
-        <w:numPr>
-          <w:ilvl w:val="0"/>
-          <w:numId w:val="8"/>
-        </w:numPr>
-        <w:rPr>
-          <w:rFonts w:ascii="Times New Roman" w:hAnsi="Times New Roman" w:cs="Times New Roman"/>
-        </w:rPr>
-      </w:pPr>
-      <w:r>
-        <w:rPr>
-          <w:rFonts w:ascii="Times New Roman" w:hAnsi="Times New Roman" w:cs="Times New Roman"/>
-        </w:rPr>
-        <w:t xml:space="preserve">Adding </w:t>
+        <w:rPr>
+          <w:rFonts w:ascii="Times New Roman" w:hAnsi="Times New Roman" w:cs="Times New Roman"/>
+        </w:rPr>
+      </w:pPr>
+      <w:r>
+        <w:rPr>
+          <w:rFonts w:ascii="Times New Roman" w:hAnsi="Times New Roman" w:cs="Times New Roman"/>
+        </w:rPr>
+        <w:t>• Expanding the recommendation catalogue with more clothing items.</w:t>
+      </w:r>
+      <w:r>
+        <w:rPr>
+          <w:rFonts w:ascii="Times New Roman" w:hAnsi="Times New Roman" w:cs="Times New Roman"/>
+        </w:rPr>
+        <w:br/>
+        <w:t xml:space="preserve">• Adding </w:t>
       </w:r>
       <w:proofErr w:type="spellStart"/>
       <w:r>
@@ -3697,87 +3830,46 @@
         </w:rPr>
         <w:t>, material, season, and occasion information to recommendations.</w:t>
       </w:r>
-    </w:p>
-    <w:p>
-      <w:pPr>
-        <w:numPr>
-          <w:ilvl w:val="0"/>
-          <w:numId w:val="8"/>
-        </w:numPr>
-        <w:rPr>
-          <w:rFonts w:ascii="Times New Roman" w:hAnsi="Times New Roman" w:cs="Times New Roman"/>
-        </w:rPr>
-      </w:pPr>
-      <w:r>
-        <w:rPr>
-          <w:rFonts w:ascii="Times New Roman" w:hAnsi="Times New Roman" w:cs="Times New Roman"/>
-        </w:rPr>
-        <w:t>Improving cold-start performance through model warm-up techniques.</w:t>
-      </w:r>
-    </w:p>
-    <w:p>
-      <w:pPr>
-        <w:numPr>
-          <w:ilvl w:val="0"/>
-          <w:numId w:val="8"/>
-        </w:numPr>
-        <w:rPr>
-          <w:rFonts w:ascii="Times New Roman" w:hAnsi="Times New Roman" w:cs="Times New Roman"/>
-        </w:rPr>
-      </w:pPr>
+      <w:r>
+        <w:rPr>
+          <w:rFonts w:ascii="Times New Roman" w:hAnsi="Times New Roman" w:cs="Times New Roman"/>
+        </w:rPr>
+        <w:br/>
+        <w:t>• Improving cold-start performance through model warm-up techniques.</w:t>
+      </w:r>
+      <w:r>
+        <w:rPr>
+          <w:rFonts w:ascii="Times New Roman" w:hAnsi="Times New Roman" w:cs="Times New Roman"/>
+        </w:rPr>
+        <w:br/>
+      </w:r>
       <w:r>
         <w:rPr>
           <w:rFonts w:ascii="Times New Roman" w:hAnsi="Times New Roman" w:cs="Times New Roman"/>
         </w:rPr>
         <w:lastRenderedPageBreak/>
-        <w:t>Using a vector database if the catalogue grows significantly.</w:t>
-      </w:r>
-    </w:p>
-    <w:p>
-      <w:pPr>
-        <w:numPr>
-          <w:ilvl w:val="0"/>
-          <w:numId w:val="8"/>
-        </w:numPr>
-        <w:rPr>
-          <w:rFonts w:ascii="Times New Roman" w:hAnsi="Times New Roman" w:cs="Times New Roman"/>
-        </w:rPr>
-      </w:pPr>
-      <w:r>
-        <w:rPr>
-          <w:rFonts w:ascii="Times New Roman" w:hAnsi="Times New Roman" w:cs="Times New Roman"/>
-        </w:rPr>
-        <w:t>Conducting larger-scale user testing to evaluate recommendation quality.</w:t>
-      </w:r>
-    </w:p>
-    <w:p>
-      <w:pPr>
-        <w:numPr>
-          <w:ilvl w:val="0"/>
-          <w:numId w:val="8"/>
-        </w:numPr>
-        <w:rPr>
-          <w:rFonts w:ascii="Times New Roman" w:hAnsi="Times New Roman" w:cs="Times New Roman"/>
-        </w:rPr>
-      </w:pPr>
-      <w:r>
-        <w:rPr>
-          <w:rFonts w:ascii="Times New Roman" w:hAnsi="Times New Roman" w:cs="Times New Roman"/>
-        </w:rPr>
-        <w:t>Introducing user preference settings to personalize recommendations.</w:t>
-      </w:r>
-    </w:p>
-    <w:p>
-      <w:pPr>
-        <w:rPr>
-          <w:rFonts w:ascii="Times New Roman" w:hAnsi="Times New Roman" w:cs="Times New Roman"/>
-        </w:rPr>
-      </w:pPr>
-      <w:r>
-        <w:rPr>
-          <w:rFonts w:ascii="Times New Roman" w:hAnsi="Times New Roman" w:cs="Times New Roman"/>
-        </w:rPr>
-        <w:t>A longer-term improvement would be retraining the style classifier as a multi-label model. The current classifier predicts only one style category, while fashion items often belong to multiple aesthetics at the same time. This would require additional dataset labelling and further evaluation, but could improve recommendation quality for ambiguous garments.</w:t>
+        <w:t>• Using a vector database if the catalogue grows significantly.</w:t>
+      </w:r>
+      <w:r>
+        <w:rPr>
+          <w:rFonts w:ascii="Times New Roman" w:hAnsi="Times New Roman" w:cs="Times New Roman"/>
+        </w:rPr>
+        <w:br/>
+        <w:t>• Conducting larger-scale user testing to evaluate recommendation quality.</w:t>
+      </w:r>
+      <w:r>
+        <w:rPr>
+          <w:rFonts w:ascii="Times New Roman" w:hAnsi="Times New Roman" w:cs="Times New Roman"/>
+        </w:rPr>
+        <w:br/>
+        <w:t>• Introducing user preference settings to personalize recommendations.</w:t>
+      </w:r>
+      <w:r>
+        <w:rPr>
+          <w:rFonts w:ascii="Times New Roman" w:hAnsi="Times New Roman" w:cs="Times New Roman"/>
+        </w:rPr>
+        <w:br/>
+        <w:t>• Improving the multi-label style model further with more balanced training data and additional labelled examples.</w:t>
       </w:r>
     </w:p>
     <w:p>
@@ -3803,7 +3895,8 @@
           <w:bCs/>
         </w:rPr>
       </w:pPr>
-      <w:bookmarkStart w:id="11" w:name="_Toc231749854"/>
+      <w:bookmarkStart w:id="21" w:name="_Toc231749854"/>
+      <w:bookmarkStart w:id="22" w:name="_Toc232515583"/>
       <w:r>
         <w:rPr>
           <w:rFonts w:ascii="Times New Roman" w:hAnsi="Times New Roman" w:cs="Times New Roman"/>
@@ -3812,45 +3905,46 @@
         </w:rPr>
         <w:t>Final Conclusion</w:t>
       </w:r>
-      <w:bookmarkEnd w:id="11"/>
-    </w:p>
-    <w:p>
-      <w:pPr>
-        <w:rPr>
-          <w:rFonts w:ascii="Times New Roman" w:hAnsi="Times New Roman" w:cs="Times New Roman"/>
-        </w:rPr>
-      </w:pPr>
-      <w:r>
-        <w:rPr>
-          <w:rFonts w:ascii="Times New Roman" w:hAnsi="Times New Roman" w:cs="Times New Roman"/>
-        </w:rPr>
-        <w:t>Runway AI Stylist was developed to transform the results of the machine learning experiments into a complete and interactive application. The final prototype combines style classification, clothing type classification, recommendation ranking, and user-friendly presentation within a single system.</w:t>
-      </w:r>
-    </w:p>
-    <w:p>
-      <w:pPr>
-        <w:rPr>
-          <w:rFonts w:ascii="Times New Roman" w:hAnsi="Times New Roman" w:cs="Times New Roman"/>
-        </w:rPr>
-      </w:pPr>
-      <w:r>
-        <w:rPr>
-          <w:rFonts w:ascii="Times New Roman" w:hAnsi="Times New Roman" w:cs="Times New Roman"/>
-        </w:rPr>
-        <w:t>Throughout development, the application evolved beyond a simple model showcase. Features such as upload validation, reliability handling, multi-style recommendations, and item replacement were added to improve both recommendation quality and user experience. The frontend was also refined to present the results in a way that is easier to understand and more aligned with the fashion domain.</w:t>
-      </w:r>
-    </w:p>
-    <w:p>
-      <w:pPr>
-        <w:rPr>
-          <w:rFonts w:ascii="Times New Roman" w:hAnsi="Times New Roman" w:cs="Times New Roman"/>
-        </w:rPr>
-      </w:pPr>
-      <w:r>
-        <w:rPr>
-          <w:rFonts w:ascii="Times New Roman" w:hAnsi="Times New Roman" w:cs="Times New Roman"/>
-        </w:rPr>
-        <w:t xml:space="preserve">The final solution uses MobileNetV3 Large for style classification, an improved ResNet34 model for clothing type classification, and CLIP embeddings for recommendation ranking. These components were selected through iterative experimentation and were integrated into a </w:t>
+      <w:bookmarkEnd w:id="21"/>
+      <w:bookmarkEnd w:id="22"/>
+    </w:p>
+    <w:p>
+      <w:pPr>
+        <w:rPr>
+          <w:rFonts w:ascii="Times New Roman" w:hAnsi="Times New Roman" w:cs="Times New Roman"/>
+        </w:rPr>
+      </w:pPr>
+      <w:r>
+        <w:rPr>
+          <w:rFonts w:ascii="Times New Roman" w:hAnsi="Times New Roman" w:cs="Times New Roman"/>
+        </w:rPr>
+        <w:t>Runway AI Stylist was developed to transform the results of the machine learning experiments into a complete and interactive application. The final prototype combines multi-label style classification, clothing type classification, CLIP-based recommendation ranking, and user-friendly presentation within a single system.</w:t>
+      </w:r>
+    </w:p>
+    <w:p>
+      <w:pPr>
+        <w:rPr>
+          <w:rFonts w:ascii="Times New Roman" w:hAnsi="Times New Roman" w:cs="Times New Roman"/>
+        </w:rPr>
+      </w:pPr>
+      <w:r>
+        <w:rPr>
+          <w:rFonts w:ascii="Times New Roman" w:hAnsi="Times New Roman" w:cs="Times New Roman"/>
+        </w:rPr>
+        <w:t>Throughout development, the application evolved beyond a simple model showcase. Features such as upload validation, reliability handling, multi-label style recommendations, recommendation mode selection, and item replacement were added to improve both recommendation quality and user experience. The frontend was also refined to present the results in a way that is easier to understand and more aligned with the fashion domain.</w:t>
+      </w:r>
+    </w:p>
+    <w:p>
+      <w:pPr>
+        <w:rPr>
+          <w:rFonts w:ascii="Times New Roman" w:hAnsi="Times New Roman" w:cs="Times New Roman"/>
+        </w:rPr>
+      </w:pPr>
+      <w:r>
+        <w:rPr>
+          <w:rFonts w:ascii="Times New Roman" w:hAnsi="Times New Roman" w:cs="Times New Roman"/>
+        </w:rPr>
+        <w:t xml:space="preserve">The final solution uses a multi-label MobileNetV3 Large model for style classification, an improved ResNet34 model for clothing type classification, and CLIP embeddings for recommendation ranking. These components were selected through iterative experimentation and were integrated into a </w:t>
       </w:r>
       <w:proofErr w:type="spellStart"/>
       <w:r>
@@ -3864,7 +3958,33 @@
         <w:rPr>
           <w:rFonts w:ascii="Times New Roman" w:hAnsi="Times New Roman" w:cs="Times New Roman"/>
         </w:rPr>
-        <w:t>-based backend and a modern web interface.</w:t>
+        <w:t xml:space="preserve"> backend and a modern web interface.</w:t>
+      </w:r>
+    </w:p>
+    <w:p>
+      <w:pPr>
+        <w:rPr>
+          <w:rFonts w:ascii="Times New Roman" w:hAnsi="Times New Roman" w:cs="Times New Roman"/>
+        </w:rPr>
+      </w:pPr>
+      <w:r>
+        <w:rPr>
+          <w:rFonts w:ascii="Times New Roman" w:hAnsi="Times New Roman" w:cs="Times New Roman"/>
+        </w:rPr>
+        <w:t>A key improvement in the final version is the recommendation mode selector. When multiple aesthetics are detected, the application can generate outfits from the combined style pool or allow the user to focus on one aesthetic. Each mode is processed by the backend, where catalogue items are filtered by the selected style pool and ranked using CLIP similarity. This makes the feature more meaningful than a simple frontend filter.</w:t>
+      </w:r>
+    </w:p>
+    <w:p>
+      <w:pPr>
+        <w:rPr>
+          <w:rFonts w:ascii="Times New Roman" w:hAnsi="Times New Roman" w:cs="Times New Roman"/>
+        </w:rPr>
+      </w:pPr>
+      <w:r>
+        <w:rPr>
+          <w:rFonts w:ascii="Times New Roman" w:hAnsi="Times New Roman" w:cs="Times New Roman"/>
+        </w:rPr>
+        <w:t>The item replacement feature also supports the active recommendation mode. This means users can refresh individual outfit pieces while staying within the selected aesthetic pool. As a result, the application gives users more control while keeping the recommendations coherent.</w:t>
       </w:r>
     </w:p>
     <w:p>
@@ -4930,6 +5050,232 @@
     </w:lvl>
   </w:abstractNum>
   <w:abstractNum w:abstractNumId="7" w15:restartNumberingAfterBreak="0">
+    <w:nsid w:val="68E907F4"/>
+    <w:multiLevelType w:val="multilevel"/>
+    <w:tmpl w:val="B6904632"/>
+    <w:lvl w:ilvl="0">
+      <w:start w:val="1"/>
+      <w:numFmt w:val="decimal"/>
+      <w:lvlText w:val="%1."/>
+      <w:lvlJc w:val="left"/>
+      <w:pPr>
+        <w:tabs>
+          <w:tab w:val="num" w:pos="720"/>
+        </w:tabs>
+        <w:ind w:left="720" w:hanging="360"/>
+      </w:pPr>
+    </w:lvl>
+    <w:lvl w:ilvl="1" w:tentative="1">
+      <w:start w:val="1"/>
+      <w:numFmt w:val="decimal"/>
+      <w:lvlText w:val="%2."/>
+      <w:lvlJc w:val="left"/>
+      <w:pPr>
+        <w:tabs>
+          <w:tab w:val="num" w:pos="1440"/>
+        </w:tabs>
+        <w:ind w:left="1440" w:hanging="360"/>
+      </w:pPr>
+    </w:lvl>
+    <w:lvl w:ilvl="2" w:tentative="1">
+      <w:start w:val="1"/>
+      <w:numFmt w:val="decimal"/>
+      <w:lvlText w:val="%3."/>
+      <w:lvlJc w:val="left"/>
+      <w:pPr>
+        <w:tabs>
+          <w:tab w:val="num" w:pos="2160"/>
+        </w:tabs>
+        <w:ind w:left="2160" w:hanging="360"/>
+      </w:pPr>
+    </w:lvl>
+    <w:lvl w:ilvl="3" w:tentative="1">
+      <w:start w:val="1"/>
+      <w:numFmt w:val="decimal"/>
+      <w:lvlText w:val="%4."/>
+      <w:lvlJc w:val="left"/>
+      <w:pPr>
+        <w:tabs>
+          <w:tab w:val="num" w:pos="2880"/>
+        </w:tabs>
+        <w:ind w:left="2880" w:hanging="360"/>
+      </w:pPr>
+    </w:lvl>
+    <w:lvl w:ilvl="4" w:tentative="1">
+      <w:start w:val="1"/>
+      <w:numFmt w:val="decimal"/>
+      <w:lvlText w:val="%5."/>
+      <w:lvlJc w:val="left"/>
+      <w:pPr>
+        <w:tabs>
+          <w:tab w:val="num" w:pos="3600"/>
+        </w:tabs>
+        <w:ind w:left="3600" w:hanging="360"/>
+      </w:pPr>
+    </w:lvl>
+    <w:lvl w:ilvl="5" w:tentative="1">
+      <w:start w:val="1"/>
+      <w:numFmt w:val="decimal"/>
+      <w:lvlText w:val="%6."/>
+      <w:lvlJc w:val="left"/>
+      <w:pPr>
+        <w:tabs>
+          <w:tab w:val="num" w:pos="4320"/>
+        </w:tabs>
+        <w:ind w:left="4320" w:hanging="360"/>
+      </w:pPr>
+    </w:lvl>
+    <w:lvl w:ilvl="6" w:tentative="1">
+      <w:start w:val="1"/>
+      <w:numFmt w:val="decimal"/>
+      <w:lvlText w:val="%7."/>
+      <w:lvlJc w:val="left"/>
+      <w:pPr>
+        <w:tabs>
+          <w:tab w:val="num" w:pos="5040"/>
+        </w:tabs>
+        <w:ind w:left="5040" w:hanging="360"/>
+      </w:pPr>
+    </w:lvl>
+    <w:lvl w:ilvl="7" w:tentative="1">
+      <w:start w:val="1"/>
+      <w:numFmt w:val="decimal"/>
+      <w:lvlText w:val="%8."/>
+      <w:lvlJc w:val="left"/>
+      <w:pPr>
+        <w:tabs>
+          <w:tab w:val="num" w:pos="5760"/>
+        </w:tabs>
+        <w:ind w:left="5760" w:hanging="360"/>
+      </w:pPr>
+    </w:lvl>
+    <w:lvl w:ilvl="8" w:tentative="1">
+      <w:start w:val="1"/>
+      <w:numFmt w:val="decimal"/>
+      <w:lvlText w:val="%9."/>
+      <w:lvlJc w:val="left"/>
+      <w:pPr>
+        <w:tabs>
+          <w:tab w:val="num" w:pos="6480"/>
+        </w:tabs>
+        <w:ind w:left="6480" w:hanging="360"/>
+      </w:pPr>
+    </w:lvl>
+  </w:abstractNum>
+  <w:abstractNum w:abstractNumId="8" w15:restartNumberingAfterBreak="0">
+    <w:nsid w:val="6F710869"/>
+    <w:multiLevelType w:val="multilevel"/>
+    <w:tmpl w:val="8676C860"/>
+    <w:lvl w:ilvl="0">
+      <w:start w:val="1"/>
+      <w:numFmt w:val="decimal"/>
+      <w:lvlText w:val="%1."/>
+      <w:lvlJc w:val="left"/>
+      <w:pPr>
+        <w:tabs>
+          <w:tab w:val="num" w:pos="720"/>
+        </w:tabs>
+        <w:ind w:left="720" w:hanging="360"/>
+      </w:pPr>
+    </w:lvl>
+    <w:lvl w:ilvl="1" w:tentative="1">
+      <w:start w:val="1"/>
+      <w:numFmt w:val="decimal"/>
+      <w:lvlText w:val="%2."/>
+      <w:lvlJc w:val="left"/>
+      <w:pPr>
+        <w:tabs>
+          <w:tab w:val="num" w:pos="1440"/>
+        </w:tabs>
+        <w:ind w:left="1440" w:hanging="360"/>
+      </w:pPr>
+    </w:lvl>
+    <w:lvl w:ilvl="2" w:tentative="1">
+      <w:start w:val="1"/>
+      <w:numFmt w:val="decimal"/>
+      <w:lvlText w:val="%3."/>
+      <w:lvlJc w:val="left"/>
+      <w:pPr>
+        <w:tabs>
+          <w:tab w:val="num" w:pos="2160"/>
+        </w:tabs>
+        <w:ind w:left="2160" w:hanging="360"/>
+      </w:pPr>
+    </w:lvl>
+    <w:lvl w:ilvl="3" w:tentative="1">
+      <w:start w:val="1"/>
+      <w:numFmt w:val="decimal"/>
+      <w:lvlText w:val="%4."/>
+      <w:lvlJc w:val="left"/>
+      <w:pPr>
+        <w:tabs>
+          <w:tab w:val="num" w:pos="2880"/>
+        </w:tabs>
+        <w:ind w:left="2880" w:hanging="360"/>
+      </w:pPr>
+    </w:lvl>
+    <w:lvl w:ilvl="4" w:tentative="1">
+      <w:start w:val="1"/>
+      <w:numFmt w:val="decimal"/>
+      <w:lvlText w:val="%5."/>
+      <w:lvlJc w:val="left"/>
+      <w:pPr>
+        <w:tabs>
+          <w:tab w:val="num" w:pos="3600"/>
+        </w:tabs>
+        <w:ind w:left="3600" w:hanging="360"/>
+      </w:pPr>
+    </w:lvl>
+    <w:lvl w:ilvl="5" w:tentative="1">
+      <w:start w:val="1"/>
+      <w:numFmt w:val="decimal"/>
+      <w:lvlText w:val="%6."/>
+      <w:lvlJc w:val="left"/>
+      <w:pPr>
+        <w:tabs>
+          <w:tab w:val="num" w:pos="4320"/>
+        </w:tabs>
+        <w:ind w:left="4320" w:hanging="360"/>
+      </w:pPr>
+    </w:lvl>
+    <w:lvl w:ilvl="6" w:tentative="1">
+      <w:start w:val="1"/>
+      <w:numFmt w:val="decimal"/>
+      <w:lvlText w:val="%7."/>
+      <w:lvlJc w:val="left"/>
+      <w:pPr>
+        <w:tabs>
+          <w:tab w:val="num" w:pos="5040"/>
+        </w:tabs>
+        <w:ind w:left="5040" w:hanging="360"/>
+      </w:pPr>
+    </w:lvl>
+    <w:lvl w:ilvl="7" w:tentative="1">
+      <w:start w:val="1"/>
+      <w:numFmt w:val="decimal"/>
+      <w:lvlText w:val="%8."/>
+      <w:lvlJc w:val="left"/>
+      <w:pPr>
+        <w:tabs>
+          <w:tab w:val="num" w:pos="5760"/>
+        </w:tabs>
+        <w:ind w:left="5760" w:hanging="360"/>
+      </w:pPr>
+    </w:lvl>
+    <w:lvl w:ilvl="8" w:tentative="1">
+      <w:start w:val="1"/>
+      <w:numFmt w:val="decimal"/>
+      <w:lvlText w:val="%9."/>
+      <w:lvlJc w:val="left"/>
+      <w:pPr>
+        <w:tabs>
+          <w:tab w:val="num" w:pos="6480"/>
+        </w:tabs>
+        <w:ind w:left="6480" w:hanging="360"/>
+      </w:pPr>
+    </w:lvl>
+  </w:abstractNum>
+  <w:abstractNum w:abstractNumId="9" w15:restartNumberingAfterBreak="0">
     <w:nsid w:val="748A1982"/>
     <w:multiLevelType w:val="multilevel"/>
     <w:tmpl w:val="6EA8989A"/>
@@ -5082,7 +5428,7 @@
     <w:abstractNumId w:val="2"/>
   </w:num>
   <w:num w:numId="2" w16cid:durableId="1727678445">
-    <w:abstractNumId w:val="7"/>
+    <w:abstractNumId w:val="9"/>
   </w:num>
   <w:num w:numId="3" w16cid:durableId="438913604">
     <w:abstractNumId w:val="4"/>
@@ -5101,6 +5447,12 @@
   </w:num>
   <w:num w:numId="8" w16cid:durableId="1994676819">
     <w:abstractNumId w:val="0"/>
+  </w:num>
+  <w:num w:numId="9" w16cid:durableId="1161700312">
+    <w:abstractNumId w:val="8"/>
+  </w:num>
+  <w:num w:numId="10" w16cid:durableId="596401575">
+    <w:abstractNumId w:val="7"/>
   </w:num>
 </w:numbering>
 </file>
@@ -5707,7 +6059,6 @@
   <w:style w:type="character" w:default="1" w:styleId="DefaultParagraphFont">
     <w:name w:val="Default Paragraph Font"/>
     <w:uiPriority w:val="1"/>
-    <w:semiHidden/>
     <w:unhideWhenUsed/>
   </w:style>
   <w:style w:type="table" w:default="1" w:styleId="TableNormal">

</xml_diff>